<commit_message>
resume updated with Associate role
</commit_message>
<xml_diff>
--- a/assets/Resume.docx
+++ b/assets/Resume.docx
@@ -1,6 +1,6 @@
 
 <file path=word/document.xml><?xml version="1.0" encoding="utf-8"?>
-<w:document xmlns:wpc="http://schemas.microsoft.com/office/word/2010/wordprocessingCanvas" xmlns:cx="http://schemas.microsoft.com/office/drawing/2014/chartex" xmlns:cx1="http://schemas.microsoft.com/office/drawing/2015/9/8/chartex" xmlns:cx2="http://schemas.microsoft.com/office/drawing/2015/10/21/chartex" xmlns:cx3="http://schemas.microsoft.com/office/drawing/2016/5/9/chartex" xmlns:cx4="http://schemas.microsoft.com/office/drawing/2016/5/10/chartex" xmlns:cx5="http://schemas.microsoft.com/office/drawing/2016/5/11/chartex" xmlns:cx6="http://schemas.microsoft.com/office/drawing/2016/5/12/chartex" xmlns:cx7="http://schemas.microsoft.com/office/drawing/2016/5/13/chartex" xmlns:cx8="http://schemas.microsoft.com/office/drawing/2016/5/14/chartex" xmlns:mc="http://schemas.openxmlformats.org/markup-compatibility/2006" xmlns:aink="http://schemas.microsoft.com/office/drawing/2016/ink" xmlns:am3d="http://schemas.microsoft.com/office/drawing/2017/model3d" xmlns:o="urn:schemas-microsoft-com:office:office" xmlns:oel="http://schemas.microsoft.com/office/2019/extlst" xmlns:r="http://schemas.openxmlformats.org/officeDocument/2006/relationships" xmlns:m="http://schemas.openxmlformats.org/officeDocument/2006/math" xmlns:v="urn:schemas-microsoft-com:vml" xmlns:wp14="http://schemas.microsoft.com/office/word/2010/wordprocessingDrawing" xmlns:wp="http://schemas.openxmlformats.org/drawingml/2006/wordprocessingDrawing" xmlns:w10="urn:schemas-microsoft-com:office:word" xmlns:w="http://schemas.openxmlformats.org/wordprocessingml/2006/main" xmlns:w14="http://schemas.microsoft.com/office/word/2010/wordml" xmlns:w15="http://schemas.microsoft.com/office/word/2012/wordml" xmlns:w16cei="http://schemas.microsoft.com/office/word/2026/wordml/cei" xmlns:w16cex="http://schemas.microsoft.com/office/word/2018/wordml/cex" xmlns:w16cid="http://schemas.microsoft.com/office/word/2016/wordml/cid" xmlns:w16="http://schemas.microsoft.com/office/word/2018/wordml" xmlns:w16du="http://schemas.microsoft.com/office/word/2023/wordml/word16du" xmlns:w16sdtdh="http://schemas.microsoft.com/office/word/2020/wordml/sdtdatahash" xmlns:w16sdtfl="http://schemas.microsoft.com/office/word/2024/wordml/sdtformatlock" xmlns:w16se="http://schemas.microsoft.com/office/word/2015/wordml/symex" xmlns:wpg="http://schemas.microsoft.com/office/word/2010/wordprocessingGroup" xmlns:wpi="http://schemas.microsoft.com/office/word/2010/wordprocessingInk" xmlns:wne="http://schemas.microsoft.com/office/word/2006/wordml" xmlns:wps="http://schemas.microsoft.com/office/word/2010/wordprocessingShape" mc:Ignorable="w14 w15 w16se w16cid w16 w16cex w16sdtdh w16sdtfl w16du wp14">
+<w:document xmlns:wpc="http://schemas.microsoft.com/office/word/2010/wordprocessingCanvas" xmlns:cx="http://schemas.microsoft.com/office/drawing/2014/chartex" xmlns:cx1="http://schemas.microsoft.com/office/drawing/2015/9/8/chartex" xmlns:cx2="http://schemas.microsoft.com/office/drawing/2015/10/21/chartex" xmlns:cx3="http://schemas.microsoft.com/office/drawing/2016/5/9/chartex" xmlns:cx4="http://schemas.microsoft.com/office/drawing/2016/5/10/chartex" xmlns:cx5="http://schemas.microsoft.com/office/drawing/2016/5/11/chartex" xmlns:cx6="http://schemas.microsoft.com/office/drawing/2016/5/12/chartex" xmlns:cx7="http://schemas.microsoft.com/office/drawing/2016/5/13/chartex" xmlns:cx8="http://schemas.microsoft.com/office/drawing/2016/5/14/chartex" xmlns:mc="http://schemas.openxmlformats.org/markup-compatibility/2006" xmlns:aink="http://schemas.microsoft.com/office/drawing/2016/ink" xmlns:am3d="http://schemas.microsoft.com/office/drawing/2017/model3d" xmlns:o="urn:schemas-microsoft-com:office:office" xmlns:oel="http://schemas.microsoft.com/office/2019/extlst" xmlns:r="http://schemas.openxmlformats.org/officeDocument/2006/relationships" xmlns:m="http://schemas.openxmlformats.org/officeDocument/2006/math" xmlns:v="urn:schemas-microsoft-com:vml" xmlns:wp14="http://schemas.microsoft.com/office/word/2010/wordprocessingDrawing" xmlns:wp="http://schemas.openxmlformats.org/drawingml/2006/wordprocessingDrawing" xmlns:w10="urn:schemas-microsoft-com:office:word" xmlns:w="http://schemas.openxmlformats.org/wordprocessingml/2006/main" xmlns:w14="http://schemas.microsoft.com/office/word/2010/wordml" xmlns:w15="http://schemas.microsoft.com/office/word/2012/wordml" xmlns:w16cex="http://schemas.microsoft.com/office/word/2018/wordml/cex" xmlns:w16cid="http://schemas.microsoft.com/office/word/2016/wordml/cid" xmlns:w16="http://schemas.microsoft.com/office/word/2018/wordml" xmlns:w16du="http://schemas.microsoft.com/office/word/2023/wordml/word16du" xmlns:w16sdtdh="http://schemas.microsoft.com/office/word/2020/wordml/sdtdatahash" xmlns:w16sdtfl="http://schemas.microsoft.com/office/word/2024/wordml/sdtformatlock" xmlns:w16se="http://schemas.microsoft.com/office/word/2015/wordml/symex" xmlns:wpg="http://schemas.microsoft.com/office/word/2010/wordprocessingGroup" xmlns:wpi="http://schemas.microsoft.com/office/word/2010/wordprocessingInk" xmlns:wne="http://schemas.microsoft.com/office/word/2006/wordml" xmlns:wps="http://schemas.microsoft.com/office/word/2010/wordprocessingShape" mc:Ignorable="w14 w15 w16se w16cid w16 w16cex w16sdtdh w16sdtfl w16du wp14">
   <w:body>
     <w:p>
       <w:pPr>
@@ -51,15 +51,7 @@
           <w:sz w:val="22"/>
           <w:szCs w:val="24"/>
         </w:rPr>
-        <w:t>AI Engineer</w:t>
-      </w:r>
-      <w:r>
-        <w:rPr>
-          <w:color w:val="333333"/>
-          <w:sz w:val="22"/>
-          <w:szCs w:val="24"/>
-        </w:rPr>
-        <w:t> | Computer Vision · LLM Systems · RAG Pipelines · Machine Learning</w:t>
+        <w:t>AI ENGINEER | INDUSTRIAL AI &amp; AUTOMATION | COMPUTER VISION | GENERATIVE AI</w:t>
       </w:r>
     </w:p>
     <w:p>
@@ -252,46 +244,118 @@
       <w:pPr>
         <w:spacing w:after="40"/>
         <w:rPr>
-          <w:color w:val="2A2A2A"/>
-          <w:sz w:val="20"/>
-          <w:szCs w:val="24"/>
-        </w:rPr>
-      </w:pPr>
-      <w:r>
-        <w:rPr>
-          <w:color w:val="2A2A2A"/>
-          <w:sz w:val="20"/>
-          <w:szCs w:val="24"/>
-        </w:rPr>
-        <w:t xml:space="preserve">AI Engineer with hands-on production experience in Computer Vision and Generative AI, currently delivering real-world client solutions at </w:t>
-      </w:r>
-      <w:proofErr w:type="spellStart"/>
-      <w:r>
-        <w:rPr>
-          <w:color w:val="2A2A2A"/>
-          <w:sz w:val="20"/>
-          <w:szCs w:val="24"/>
-        </w:rPr>
-        <w:t>Difinity</w:t>
-      </w:r>
-      <w:proofErr w:type="spellEnd"/>
-      <w:r>
-        <w:rPr>
-          <w:color w:val="2A2A2A"/>
-          <w:sz w:val="20"/>
-          <w:szCs w:val="24"/>
-        </w:rPr>
-        <w:t xml:space="preserve"> Digital. Built and deployed end-to-end CV pipelines using YOLOv26 detection and segmentation models for industrial monitoring, and integrated SAM (Segment Anything Model) into Label Studio to accelerate annotation workflows. Simultaneously building a multi-provider LLM evaluation and orchestration platform with RAG pipelines, memory systems, and SSE streaming. Published researcher at IEEE ICNPCV 2026. Seeking a full-time AI Engineer role to bring production-grade AI engineering skills to challenging problems.</w:t>
-      </w:r>
-    </w:p>
-    <w:p>
-      <w:pPr>
-        <w:spacing w:after="40"/>
-        <w:rPr>
           <w:sz w:val="2"/>
           <w:szCs w:val="2"/>
         </w:rPr>
       </w:pPr>
+      <w:r>
+        <w:rPr>
+          <w:b/>
+          <w:bCs/>
+          <w:color w:val="2A2A2A"/>
+          <w:sz w:val="20"/>
+          <w:szCs w:val="24"/>
+        </w:rPr>
+        <w:t>AI Engineer</w:t>
+      </w:r>
+      <w:r>
+        <w:rPr>
+          <w:color w:val="2A2A2A"/>
+          <w:sz w:val="20"/>
+          <w:szCs w:val="24"/>
+        </w:rPr>
+        <w:t xml:space="preserve"> at </w:t>
+      </w:r>
+      <w:proofErr w:type="spellStart"/>
+      <w:r>
+        <w:rPr>
+          <w:color w:val="2A2A2A"/>
+          <w:sz w:val="20"/>
+          <w:szCs w:val="24"/>
+        </w:rPr>
+        <w:t>Difinity</w:t>
+      </w:r>
+      <w:proofErr w:type="spellEnd"/>
+      <w:r>
+        <w:rPr>
+          <w:color w:val="2A2A2A"/>
+          <w:sz w:val="20"/>
+          <w:szCs w:val="24"/>
+        </w:rPr>
+        <w:t xml:space="preserve"> Digital LLP with hands-on experience developing </w:t>
+      </w:r>
+      <w:r>
+        <w:rPr>
+          <w:b/>
+          <w:bCs/>
+          <w:color w:val="2A2A2A"/>
+          <w:sz w:val="20"/>
+          <w:szCs w:val="24"/>
+        </w:rPr>
+        <w:t>AI-driven industrial automation, computer vision, machine learning, and Generative AI solutions</w:t>
+      </w:r>
+      <w:r>
+        <w:rPr>
+          <w:color w:val="2A2A2A"/>
+          <w:sz w:val="20"/>
+          <w:szCs w:val="24"/>
+        </w:rPr>
+        <w:t xml:space="preserve">. Experienced in building industrial monitoring pipelines using YOLOv26 detection and segmentation models, integrating the Segment Anything Model (SAM) into annotation workflows, and applying </w:t>
+      </w:r>
+      <w:r>
+        <w:rPr>
+          <w:b/>
+          <w:bCs/>
+          <w:color w:val="2A2A2A"/>
+          <w:sz w:val="20"/>
+          <w:szCs w:val="24"/>
+        </w:rPr>
+        <w:t>BERT-based Transformer models</w:t>
+      </w:r>
+      <w:r>
+        <w:rPr>
+          <w:color w:val="2A2A2A"/>
+          <w:sz w:val="20"/>
+          <w:szCs w:val="24"/>
+        </w:rPr>
+        <w:t xml:space="preserve"> to application-specific NLP tasks. Skilled in Python backend development, LLM integration, Retrieval-Augmented Generation (RAG), vector databases, real-time streaming, and AI workflow orchestration. Developing </w:t>
+      </w:r>
+      <w:proofErr w:type="spellStart"/>
+      <w:r>
+        <w:rPr>
+          <w:color w:val="2A2A2A"/>
+          <w:sz w:val="20"/>
+          <w:szCs w:val="24"/>
+        </w:rPr>
+        <w:t>OpenMind</w:t>
+      </w:r>
+      <w:proofErr w:type="spellEnd"/>
+      <w:r>
+        <w:rPr>
+          <w:color w:val="2A2A2A"/>
+          <w:sz w:val="20"/>
+          <w:szCs w:val="24"/>
+        </w:rPr>
+        <w:t xml:space="preserve"> AI Platform for multi-provider LLM evaluation and orchestration. Author of peer-reviewed research published in </w:t>
+      </w:r>
+      <w:r>
+        <w:rPr>
+          <w:b/>
+          <w:bCs/>
+          <w:color w:val="2A2A2A"/>
+          <w:sz w:val="20"/>
+          <w:szCs w:val="24"/>
+        </w:rPr>
+        <w:t>IEEE Xplore</w:t>
+      </w:r>
+      <w:r>
+        <w:rPr>
+          <w:color w:val="2A2A2A"/>
+          <w:sz w:val="20"/>
+          <w:szCs w:val="24"/>
+        </w:rPr>
+        <w:t xml:space="preserve"> on hybrid CNN–YOLO architecture for vehicle damage assessment.</w:t>
+      </w:r>
     </w:p>
     <w:p>
       <w:pPr>
@@ -329,33 +393,27 @@
           <w:sz w:val="20"/>
           <w:szCs w:val="24"/>
         </w:rPr>
-        <w:t>Computer Vision</w:t>
-      </w:r>
-      <w:proofErr w:type="gramStart"/>
+        <w:t>M</w:t>
+      </w:r>
       <w:r>
         <w:rPr>
           <w:b/>
-          <w:sz w:val="20"/>
-          <w:szCs w:val="24"/>
-        </w:rPr>
-        <w:t xml:space="preserve">:  </w:t>
-      </w:r>
-      <w:r>
-        <w:rPr>
-          <w:color w:val="333333"/>
-          <w:sz w:val="20"/>
-          <w:szCs w:val="24"/>
-        </w:rPr>
-        <w:t>YOLOv26</w:t>
-      </w:r>
-      <w:proofErr w:type="gramEnd"/>
-      <w:r>
-        <w:rPr>
-          <w:color w:val="333333"/>
-          <w:sz w:val="20"/>
-          <w:szCs w:val="24"/>
-        </w:rPr>
-        <w:t xml:space="preserve"> (Nano/Small/Medium/Large), YOLOv26-Seg, SAM (Segment Anything Model), CNNs, Object Detection, Instance Segmentation, Image Classification, Model Benchmarking</w:t>
+          <w:bCs/>
+          <w:sz w:val="20"/>
+          <w:szCs w:val="24"/>
+        </w:rPr>
+        <w:t>achine Learning &amp; Computer Vision</w:t>
+      </w:r>
+      <w:r>
+        <w:rPr>
+          <w:b/>
+          <w:sz w:val="20"/>
+          <w:szCs w:val="24"/>
+        </w:rPr>
+        <w:t xml:space="preserve">: </w:t>
+      </w:r>
+      <w:r>
+        <w:t>YOLOv26 (Nano/Small/Medium/Large), YOLOv26-Seg, SAM, CNNs, BERT, Object Detection, Instance Segmentation, Image Classification, Model Training &amp; Evaluation, Industrial Monitoring &amp; Automation, Object Counting, Conveyor Belt Monitoring</w:t>
       </w:r>
     </w:p>
     <w:p>
@@ -374,14 +432,13 @@
         </w:rPr>
         <w:t>LLM &amp; Generative AI</w:t>
       </w:r>
-      <w:proofErr w:type="gramStart"/>
       <w:r>
         <w:rPr>
           <w:b/>
           <w:sz w:val="20"/>
           <w:szCs w:val="24"/>
         </w:rPr>
-        <w:t xml:space="preserve">:  </w:t>
+        <w:t xml:space="preserve">: </w:t>
       </w:r>
       <w:r>
         <w:rPr>
@@ -389,22 +446,14 @@
           <w:sz w:val="20"/>
           <w:szCs w:val="24"/>
         </w:rPr>
-        <w:t>LLM</w:t>
-      </w:r>
-      <w:proofErr w:type="gramEnd"/>
-      <w:r>
-        <w:rPr>
-          <w:color w:val="333333"/>
-          <w:sz w:val="20"/>
-          <w:szCs w:val="24"/>
-        </w:rPr>
-        <w:t xml:space="preserve"> APIs (Gemini, OpenAI, NVIDIA), RAG Pipelines, Prompt Engineering, SSE Streaming, AI Memory Systems, Embedding Models, Retrieval Systems, Conversational AI</w:t>
+        <w:t>LLM APIs, RAG, Prompt Engineering, Multi-Provider Inference, LLM Evaluation, Embeddings, Semantic Search, SSE Streaming, AI Memory Systems, Agentic AI, Tool Calling, Workflow Orchestration</w:t>
       </w:r>
     </w:p>
     <w:p>
       <w:pPr>
         <w:spacing w:before="20" w:after="20"/>
         <w:rPr>
+          <w:color w:val="333333"/>
           <w:sz w:val="20"/>
           <w:szCs w:val="24"/>
         </w:rPr>
@@ -415,16 +464,7 @@
           <w:sz w:val="20"/>
           <w:szCs w:val="24"/>
         </w:rPr>
-        <w:t>Frameworks &amp; Libraries</w:t>
-      </w:r>
-      <w:proofErr w:type="gramStart"/>
-      <w:r>
-        <w:rPr>
-          <w:b/>
-          <w:sz w:val="20"/>
-          <w:szCs w:val="24"/>
-        </w:rPr>
-        <w:t xml:space="preserve">:  </w:t>
+        <w:t xml:space="preserve">Frameworks &amp; Libraries: </w:t>
       </w:r>
       <w:proofErr w:type="spellStart"/>
       <w:r>
@@ -436,7 +476,6 @@
         <w:t>PyTorch</w:t>
       </w:r>
       <w:proofErr w:type="spellEnd"/>
-      <w:proofErr w:type="gramEnd"/>
       <w:r>
         <w:rPr>
           <w:color w:val="333333"/>
@@ -540,6 +579,7 @@
       <w:pPr>
         <w:spacing w:before="20" w:after="20"/>
         <w:rPr>
+          <w:color w:val="333333"/>
           <w:sz w:val="20"/>
           <w:szCs w:val="24"/>
         </w:rPr>
@@ -550,16 +590,23 @@
           <w:sz w:val="20"/>
           <w:szCs w:val="24"/>
         </w:rPr>
-        <w:t>Infrastructure &amp; Tools</w:t>
-      </w:r>
-      <w:proofErr w:type="gramStart"/>
+        <w:t>Backend, Infrastructure &amp; Tools</w:t>
+      </w:r>
       <w:r>
         <w:rPr>
           <w:b/>
           <w:sz w:val="20"/>
           <w:szCs w:val="24"/>
         </w:rPr>
-        <w:t xml:space="preserve">:  </w:t>
+        <w:t>:</w:t>
+      </w:r>
+      <w:r>
+        <w:rPr>
+          <w:b/>
+          <w:sz w:val="20"/>
+          <w:szCs w:val="24"/>
+        </w:rPr>
+        <w:t xml:space="preserve"> </w:t>
       </w:r>
       <w:r>
         <w:rPr>
@@ -567,34 +614,25 @@
           <w:sz w:val="20"/>
           <w:szCs w:val="24"/>
         </w:rPr>
-        <w:t>Python</w:t>
-      </w:r>
-      <w:proofErr w:type="gramEnd"/>
+        <w:t xml:space="preserve">Python, SQL, REST APIs, PostgreSQL, </w:t>
+      </w:r>
+      <w:proofErr w:type="spellStart"/>
       <w:r>
         <w:rPr>
           <w:color w:val="333333"/>
           <w:sz w:val="20"/>
           <w:szCs w:val="24"/>
         </w:rPr>
-        <w:t xml:space="preserve">, SQL, Docker, Docker Compose, Git, Linux, PostgreSQL, </w:t>
-      </w:r>
-      <w:proofErr w:type="spellStart"/>
+        <w:t>pgvector</w:t>
+      </w:r>
+      <w:proofErr w:type="spellEnd"/>
       <w:r>
         <w:rPr>
           <w:color w:val="333333"/>
           <w:sz w:val="20"/>
           <w:szCs w:val="24"/>
         </w:rPr>
-        <w:t>pgvector</w:t>
-      </w:r>
-      <w:proofErr w:type="spellEnd"/>
-      <w:r>
-        <w:rPr>
-          <w:color w:val="333333"/>
-          <w:sz w:val="20"/>
-          <w:szCs w:val="24"/>
-        </w:rPr>
-        <w:t>, VS Code, Jupyter Notebook</w:t>
+        <w:t>, Docker, Docker Compose, Git, Linux, VS Code, Jupyter Notebook</w:t>
       </w:r>
     </w:p>
     <w:p>
@@ -612,16 +650,23 @@
           <w:sz w:val="20"/>
           <w:szCs w:val="24"/>
         </w:rPr>
-        <w:t>Cloud &amp; Platforms</w:t>
-      </w:r>
-      <w:proofErr w:type="gramStart"/>
+        <w:t>Cloud &amp; Certifications</w:t>
+      </w:r>
       <w:r>
         <w:rPr>
           <w:b/>
           <w:sz w:val="20"/>
           <w:szCs w:val="24"/>
         </w:rPr>
-        <w:t xml:space="preserve">:  </w:t>
+        <w:t>:</w:t>
+      </w:r>
+      <w:r>
+        <w:rPr>
+          <w:b/>
+          <w:sz w:val="20"/>
+          <w:szCs w:val="24"/>
+        </w:rPr>
+        <w:t xml:space="preserve"> </w:t>
       </w:r>
       <w:r>
         <w:rPr>
@@ -629,16 +674,7 @@
           <w:sz w:val="20"/>
           <w:szCs w:val="24"/>
         </w:rPr>
-        <w:t>Oracle</w:t>
-      </w:r>
-      <w:proofErr w:type="gramEnd"/>
-      <w:r>
-        <w:rPr>
-          <w:color w:val="333333"/>
-          <w:sz w:val="20"/>
-          <w:szCs w:val="24"/>
-        </w:rPr>
-        <w:t xml:space="preserve"> Cloud Infrastructure (AI Foundations Associate), AWS Fundamentals, Google AI Essentials</w:t>
+        <w:t>Oracle Cloud Infrastructure (AI Foundations Associate), AWS Fundamentals, Google AI Essentials</w:t>
       </w:r>
     </w:p>
     <w:p>
@@ -690,27 +726,7 @@
           <w:sz w:val="22"/>
           <w:szCs w:val="24"/>
         </w:rPr>
-        <w:t xml:space="preserve">AI Engineer Intern — </w:t>
-      </w:r>
-      <w:proofErr w:type="spellStart"/>
-      <w:r>
-        <w:rPr>
-          <w:b/>
-          <w:color w:val="0D0D0D"/>
-          <w:sz w:val="22"/>
-          <w:szCs w:val="24"/>
-        </w:rPr>
-        <w:t>Difinity</w:t>
-      </w:r>
-      <w:proofErr w:type="spellEnd"/>
-      <w:r>
-        <w:rPr>
-          <w:b/>
-          <w:color w:val="0D0D0D"/>
-          <w:sz w:val="22"/>
-          <w:szCs w:val="24"/>
-        </w:rPr>
-        <w:t xml:space="preserve"> Digital</w:t>
+        <w:t>AI Engineer — Associate 1</w:t>
       </w:r>
       <w:r>
         <w:rPr>
@@ -725,7 +741,7 @@
           <w:sz w:val="20"/>
           <w:szCs w:val="24"/>
         </w:rPr>
-        <w:t>Jun 2026</w:t>
+        <w:t>Sep</w:t>
       </w:r>
       <w:r>
         <w:rPr>
@@ -733,6 +749,14 @@
           <w:sz w:val="20"/>
           <w:szCs w:val="24"/>
         </w:rPr>
+        <w:t xml:space="preserve"> 2026</w:t>
+      </w:r>
+      <w:r>
+        <w:rPr>
+          <w:color w:val="555555"/>
+          <w:sz w:val="20"/>
+          <w:szCs w:val="24"/>
+        </w:rPr>
         <w:t xml:space="preserve"> – </w:t>
       </w:r>
       <w:r>
@@ -741,7 +765,7 @@
           <w:sz w:val="20"/>
           <w:szCs w:val="24"/>
         </w:rPr>
-        <w:t>Sep 2026</w:t>
+        <w:t>Present</w:t>
       </w:r>
     </w:p>
     <w:p>
@@ -752,6 +776,30 @@
           <w:szCs w:val="24"/>
         </w:rPr>
       </w:pPr>
+      <w:proofErr w:type="spellStart"/>
+      <w:r>
+        <w:rPr>
+          <w:b/>
+          <w:bCs/>
+          <w:iCs/>
+          <w:color w:val="auto"/>
+          <w:sz w:val="22"/>
+          <w:szCs w:val="28"/>
+        </w:rPr>
+        <w:t>Difinity</w:t>
+      </w:r>
+      <w:proofErr w:type="spellEnd"/>
+      <w:r>
+        <w:rPr>
+          <w:b/>
+          <w:bCs/>
+          <w:iCs/>
+          <w:color w:val="auto"/>
+          <w:sz w:val="22"/>
+          <w:szCs w:val="28"/>
+        </w:rPr>
+        <w:t xml:space="preserve"> Digital LLP</w:t>
+      </w:r>
       <w:r>
         <w:rPr>
           <w:b/>
@@ -761,43 +809,609 @@
           <w:sz w:val="20"/>
           <w:szCs w:val="24"/>
         </w:rPr>
+        <w:t xml:space="preserve">                                      </w:t>
+      </w:r>
+      <w:r>
+        <w:rPr>
+          <w:b/>
+          <w:bCs/>
+          <w:i/>
+          <w:color w:val="555555"/>
+          <w:sz w:val="20"/>
+          <w:szCs w:val="24"/>
+        </w:rPr>
+        <w:t xml:space="preserve"> </w:t>
+      </w:r>
+      <w:r>
+        <w:rPr>
+          <w:b/>
+          <w:bCs/>
+          <w:i/>
+          <w:color w:val="555555"/>
+          <w:sz w:val="20"/>
+          <w:szCs w:val="24"/>
+        </w:rPr>
+        <w:t xml:space="preserve">                               </w:t>
+      </w:r>
+      <w:r>
+        <w:rPr>
+          <w:b/>
+          <w:bCs/>
+          <w:i/>
+          <w:color w:val="555555"/>
+          <w:sz w:val="20"/>
+          <w:szCs w:val="24"/>
+        </w:rPr>
+        <w:t xml:space="preserve"> </w:t>
+      </w:r>
+      <w:r>
+        <w:rPr>
+          <w:b/>
+          <w:bCs/>
+          <w:i/>
+          <w:color w:val="555555"/>
+          <w:sz w:val="20"/>
+          <w:szCs w:val="24"/>
+        </w:rPr>
+        <w:t xml:space="preserve">                                                                                             </w:t>
+      </w:r>
+      <w:r>
+        <w:rPr>
+          <w:b/>
+          <w:bCs/>
+          <w:i/>
+          <w:color w:val="555555"/>
+          <w:sz w:val="20"/>
+          <w:szCs w:val="24"/>
+        </w:rPr>
         <w:t>Kochi, Kerala</w:t>
       </w:r>
     </w:p>
     <w:p>
       <w:pPr>
-        <w:pStyle w:val="ListBullet"/>
+        <w:pStyle w:val="ListParagraph"/>
         <w:numPr>
           <w:ilvl w:val="0"/>
-          <w:numId w:val="0"/>
+          <w:numId w:val="19"/>
         </w:numPr>
+        <w:tabs>
+          <w:tab w:val="right" w:pos="10205"/>
+        </w:tabs>
+        <w:spacing w:before="60"/>
+        <w:ind w:left="142" w:hanging="142"/>
+        <w:rPr>
+          <w:bCs/>
+          <w:color w:val="0D0D0D"/>
+          <w:sz w:val="20"/>
+        </w:rPr>
+      </w:pPr>
+      <w:r>
+        <w:rPr>
+          <w:bCs/>
+          <w:color w:val="0D0D0D"/>
+          <w:sz w:val="20"/>
+        </w:rPr>
+        <w:t xml:space="preserve">Develop AI-driven solutions for </w:t>
+      </w:r>
+      <w:r>
+        <w:rPr>
+          <w:b/>
+          <w:color w:val="0D0D0D"/>
+          <w:sz w:val="20"/>
+        </w:rPr>
+        <w:t>industrial automation</w:t>
+      </w:r>
+      <w:r>
+        <w:rPr>
+          <w:bCs/>
+          <w:color w:val="0D0D0D"/>
+          <w:sz w:val="20"/>
+        </w:rPr>
+        <w:t xml:space="preserve"> and application-specific use cases, applying </w:t>
+      </w:r>
+      <w:r>
+        <w:rPr>
+          <w:b/>
+          <w:color w:val="0D0D0D"/>
+          <w:sz w:val="20"/>
+        </w:rPr>
+        <w:t>computer vision</w:t>
+      </w:r>
+      <w:r>
+        <w:rPr>
+          <w:bCs/>
+          <w:color w:val="0D0D0D"/>
+          <w:sz w:val="20"/>
+        </w:rPr>
+        <w:t xml:space="preserve">, </w:t>
+      </w:r>
+      <w:r>
+        <w:rPr>
+          <w:b/>
+          <w:color w:val="0D0D0D"/>
+          <w:sz w:val="20"/>
+        </w:rPr>
+        <w:t>machine learning</w:t>
+      </w:r>
+      <w:r>
+        <w:rPr>
+          <w:bCs/>
+          <w:color w:val="0D0D0D"/>
+          <w:sz w:val="20"/>
+        </w:rPr>
+        <w:t xml:space="preserve">, and </w:t>
+      </w:r>
+      <w:r>
+        <w:rPr>
+          <w:b/>
+          <w:color w:val="0D0D0D"/>
+          <w:sz w:val="20"/>
+        </w:rPr>
+        <w:t>BERT</w:t>
+      </w:r>
+      <w:r>
+        <w:rPr>
+          <w:bCs/>
+          <w:color w:val="0D0D0D"/>
+          <w:sz w:val="20"/>
+        </w:rPr>
+        <w:t>-based Transformer models to visual monitoring and NLP tasks.</w:t>
+      </w:r>
+    </w:p>
+    <w:p>
+      <w:pPr>
+        <w:pStyle w:val="ListParagraph"/>
+        <w:numPr>
+          <w:ilvl w:val="0"/>
+          <w:numId w:val="19"/>
+        </w:numPr>
+        <w:tabs>
+          <w:tab w:val="right" w:pos="10205"/>
+        </w:tabs>
+        <w:spacing w:before="60"/>
+        <w:ind w:left="142" w:hanging="142"/>
+        <w:rPr>
+          <w:bCs/>
+          <w:color w:val="0D0D0D"/>
+          <w:sz w:val="20"/>
+        </w:rPr>
+      </w:pPr>
+      <w:r>
+        <w:rPr>
+          <w:bCs/>
+          <w:color w:val="0D0D0D"/>
+          <w:sz w:val="20"/>
+        </w:rPr>
+        <w:t xml:space="preserve">Build and maintain </w:t>
+      </w:r>
+      <w:r>
+        <w:rPr>
+          <w:b/>
+          <w:color w:val="0D0D0D"/>
+          <w:sz w:val="20"/>
+        </w:rPr>
+        <w:t>YOLOv26</w:t>
+      </w:r>
+      <w:r>
+        <w:rPr>
+          <w:bCs/>
+          <w:color w:val="0D0D0D"/>
+          <w:sz w:val="20"/>
+        </w:rPr>
+        <w:t xml:space="preserve">-based </w:t>
+      </w:r>
+      <w:r>
+        <w:rPr>
+          <w:b/>
+          <w:color w:val="0D0D0D"/>
+          <w:sz w:val="20"/>
+        </w:rPr>
+        <w:t>object detection</w:t>
+      </w:r>
+      <w:r>
+        <w:rPr>
+          <w:bCs/>
+          <w:color w:val="0D0D0D"/>
+          <w:sz w:val="20"/>
+        </w:rPr>
+        <w:t xml:space="preserve"> and </w:t>
+      </w:r>
+      <w:r>
+        <w:rPr>
+          <w:b/>
+          <w:color w:val="0D0D0D"/>
+          <w:sz w:val="20"/>
+        </w:rPr>
+        <w:t>segmentation</w:t>
+      </w:r>
+      <w:r>
+        <w:rPr>
+          <w:bCs/>
+          <w:color w:val="0D0D0D"/>
+          <w:sz w:val="20"/>
+        </w:rPr>
+        <w:t xml:space="preserve"> pipelines for industrial monitoring, object localization, and automated visual analysis.</w:t>
+      </w:r>
+    </w:p>
+    <w:p>
+      <w:pPr>
+        <w:pStyle w:val="ListParagraph"/>
+        <w:numPr>
+          <w:ilvl w:val="0"/>
+          <w:numId w:val="19"/>
+        </w:numPr>
+        <w:tabs>
+          <w:tab w:val="right" w:pos="10205"/>
+        </w:tabs>
+        <w:spacing w:before="60"/>
+        <w:ind w:left="142" w:hanging="142"/>
+        <w:rPr>
+          <w:bCs/>
+          <w:color w:val="0D0D0D"/>
+          <w:sz w:val="20"/>
+        </w:rPr>
+      </w:pPr>
+      <w:r>
+        <w:rPr>
+          <w:bCs/>
+          <w:color w:val="0D0D0D"/>
+          <w:sz w:val="20"/>
+        </w:rPr>
+        <w:t xml:space="preserve">Develop </w:t>
+      </w:r>
+      <w:r>
+        <w:rPr>
+          <w:b/>
+          <w:color w:val="0D0D0D"/>
+          <w:sz w:val="20"/>
+        </w:rPr>
+        <w:t>Generative AI</w:t>
+      </w:r>
+      <w:r>
+        <w:rPr>
+          <w:bCs/>
+          <w:color w:val="0D0D0D"/>
+          <w:sz w:val="20"/>
+        </w:rPr>
+        <w:t xml:space="preserve"> applications integrating multiple LLM providers, including OpenAI, Google Gemini, and NVIDIA, with configurable inference and real-time response streaming.</w:t>
+      </w:r>
+    </w:p>
+    <w:p>
+      <w:pPr>
+        <w:pStyle w:val="ListParagraph"/>
+        <w:numPr>
+          <w:ilvl w:val="0"/>
+          <w:numId w:val="19"/>
+        </w:numPr>
+        <w:tabs>
+          <w:tab w:val="right" w:pos="10205"/>
+        </w:tabs>
+        <w:spacing w:before="60"/>
+        <w:ind w:left="142" w:hanging="142"/>
+        <w:rPr>
+          <w:bCs/>
+          <w:color w:val="0D0D0D"/>
+          <w:sz w:val="20"/>
+        </w:rPr>
+      </w:pPr>
+      <w:r>
+        <w:rPr>
+          <w:bCs/>
+          <w:color w:val="0D0D0D"/>
+          <w:sz w:val="20"/>
+        </w:rPr>
+        <w:t xml:space="preserve">Develop </w:t>
+      </w:r>
+      <w:r>
+        <w:rPr>
+          <w:b/>
+          <w:color w:val="0D0D0D"/>
+          <w:sz w:val="20"/>
+        </w:rPr>
+        <w:t>RAG</w:t>
+      </w:r>
+      <w:r>
+        <w:rPr>
+          <w:bCs/>
+          <w:color w:val="0D0D0D"/>
+          <w:sz w:val="20"/>
+        </w:rPr>
+        <w:t xml:space="preserve"> pipelines involving document ingestion, text chunking, embedding integration, and </w:t>
+      </w:r>
+      <w:proofErr w:type="spellStart"/>
+      <w:r>
+        <w:rPr>
+          <w:bCs/>
+          <w:color w:val="0D0D0D"/>
+          <w:sz w:val="20"/>
+        </w:rPr>
+        <w:t>pgvector</w:t>
+      </w:r>
+      <w:proofErr w:type="spellEnd"/>
+      <w:r>
+        <w:rPr>
+          <w:bCs/>
+          <w:color w:val="0D0D0D"/>
+          <w:sz w:val="20"/>
+        </w:rPr>
+        <w:t>-based semantic retrieval for context-aware AI applications.</w:t>
+      </w:r>
+    </w:p>
+    <w:p>
+      <w:pPr>
+        <w:pStyle w:val="ListParagraph"/>
+        <w:numPr>
+          <w:ilvl w:val="0"/>
+          <w:numId w:val="19"/>
+        </w:numPr>
+        <w:tabs>
+          <w:tab w:val="right" w:pos="10205"/>
+        </w:tabs>
+        <w:spacing w:before="60"/>
+        <w:ind w:left="142" w:hanging="142"/>
+        <w:rPr>
+          <w:bCs/>
+          <w:color w:val="0D0D0D"/>
+          <w:sz w:val="20"/>
+        </w:rPr>
+      </w:pPr>
+      <w:r>
+        <w:rPr>
+          <w:bCs/>
+          <w:color w:val="0D0D0D"/>
+          <w:sz w:val="20"/>
+        </w:rPr>
+        <w:t xml:space="preserve">Design multi-step </w:t>
+      </w:r>
+      <w:r>
+        <w:rPr>
+          <w:b/>
+          <w:color w:val="0D0D0D"/>
+          <w:sz w:val="20"/>
+        </w:rPr>
+        <w:t>agentic AI</w:t>
+      </w:r>
+      <w:r>
+        <w:rPr>
+          <w:bCs/>
+          <w:color w:val="0D0D0D"/>
+          <w:sz w:val="20"/>
+        </w:rPr>
+        <w:t xml:space="preserve"> workflows incorporating conditional branching, tool use, and workflow orchestration for complex automation tasks.</w:t>
+      </w:r>
+    </w:p>
+    <w:p>
+      <w:pPr>
+        <w:pStyle w:val="ListParagraph"/>
+        <w:numPr>
+          <w:ilvl w:val="0"/>
+          <w:numId w:val="19"/>
+        </w:numPr>
+        <w:tabs>
+          <w:tab w:val="right" w:pos="10205"/>
+        </w:tabs>
+        <w:spacing w:before="60"/>
+        <w:ind w:left="142" w:hanging="142"/>
+        <w:rPr>
+          <w:bCs/>
+          <w:color w:val="0D0D0D"/>
+          <w:sz w:val="20"/>
+        </w:rPr>
+      </w:pPr>
+      <w:r>
+        <w:rPr>
+          <w:bCs/>
+          <w:color w:val="0D0D0D"/>
+          <w:sz w:val="20"/>
+        </w:rPr>
+        <w:t xml:space="preserve">Build Python backend services and REST APIs using </w:t>
+      </w:r>
+      <w:proofErr w:type="spellStart"/>
+      <w:r>
+        <w:rPr>
+          <w:bCs/>
+          <w:color w:val="0D0D0D"/>
+          <w:sz w:val="20"/>
+        </w:rPr>
+        <w:t>FastAPI</w:t>
+      </w:r>
+      <w:proofErr w:type="spellEnd"/>
+      <w:r>
+        <w:rPr>
+          <w:bCs/>
+          <w:color w:val="0D0D0D"/>
+          <w:sz w:val="20"/>
+        </w:rPr>
+        <w:t xml:space="preserve">, with PostgreSQL, </w:t>
+      </w:r>
+      <w:proofErr w:type="spellStart"/>
+      <w:r>
+        <w:rPr>
+          <w:bCs/>
+          <w:color w:val="0D0D0D"/>
+          <w:sz w:val="20"/>
+        </w:rPr>
+        <w:t>pgvector</w:t>
+      </w:r>
+      <w:proofErr w:type="spellEnd"/>
+      <w:r>
+        <w:rPr>
+          <w:bCs/>
+          <w:color w:val="0D0D0D"/>
+          <w:sz w:val="20"/>
+        </w:rPr>
+        <w:t>, and Docker-based development environments.</w:t>
+      </w:r>
+    </w:p>
+    <w:p>
+      <w:pPr>
+        <w:pStyle w:val="ListParagraph"/>
+        <w:numPr>
+          <w:ilvl w:val="0"/>
+          <w:numId w:val="19"/>
+        </w:numPr>
+        <w:tabs>
+          <w:tab w:val="right" w:pos="10205"/>
+        </w:tabs>
+        <w:spacing w:before="60"/>
+        <w:ind w:left="142" w:hanging="142"/>
+        <w:rPr>
+          <w:bCs/>
+          <w:color w:val="0D0D0D"/>
+          <w:sz w:val="20"/>
+        </w:rPr>
+      </w:pPr>
+      <w:r>
+        <w:rPr>
+          <w:bCs/>
+          <w:color w:val="0D0D0D"/>
+          <w:sz w:val="20"/>
+        </w:rPr>
+        <w:t>Collaborate with engineering teams on system architecture, implementation, code reviews, and sprint planning.</w:t>
+      </w:r>
+    </w:p>
+    <w:p>
+      <w:pPr>
+        <w:tabs>
+          <w:tab w:val="right" w:pos="10205"/>
+        </w:tabs>
+        <w:spacing w:before="60"/>
+        <w:rPr>
+          <w:sz w:val="20"/>
+          <w:szCs w:val="24"/>
+        </w:rPr>
+      </w:pPr>
+      <w:r>
+        <w:rPr>
+          <w:b/>
+          <w:color w:val="0D0D0D"/>
+          <w:sz w:val="22"/>
+          <w:szCs w:val="24"/>
+        </w:rPr>
+        <w:t>A</w:t>
+      </w:r>
+      <w:r>
+        <w:rPr>
+          <w:b/>
+          <w:color w:val="0D0D0D"/>
+          <w:sz w:val="22"/>
+          <w:szCs w:val="24"/>
+        </w:rPr>
+        <w:t xml:space="preserve">I Engineer Intern — </w:t>
+      </w:r>
+      <w:proofErr w:type="spellStart"/>
+      <w:r>
+        <w:rPr>
+          <w:b/>
+          <w:color w:val="0D0D0D"/>
+          <w:sz w:val="22"/>
+          <w:szCs w:val="24"/>
+        </w:rPr>
+        <w:t>Difinity</w:t>
+      </w:r>
+      <w:proofErr w:type="spellEnd"/>
+      <w:r>
+        <w:rPr>
+          <w:b/>
+          <w:color w:val="0D0D0D"/>
+          <w:sz w:val="22"/>
+          <w:szCs w:val="24"/>
+        </w:rPr>
+        <w:t xml:space="preserve"> Digital</w:t>
+      </w:r>
+      <w:r>
+        <w:rPr>
+          <w:sz w:val="20"/>
+          <w:szCs w:val="24"/>
+        </w:rPr>
+        <w:tab/>
+      </w:r>
+      <w:r>
+        <w:rPr>
+          <w:color w:val="555555"/>
+          <w:sz w:val="20"/>
+          <w:szCs w:val="24"/>
+        </w:rPr>
+        <w:t>Jun 2026</w:t>
+      </w:r>
+      <w:r>
+        <w:rPr>
+          <w:color w:val="555555"/>
+          <w:sz w:val="20"/>
+          <w:szCs w:val="24"/>
+        </w:rPr>
+        <w:t xml:space="preserve"> – </w:t>
+      </w:r>
+      <w:r>
+        <w:rPr>
+          <w:color w:val="555555"/>
+          <w:sz w:val="20"/>
+          <w:szCs w:val="24"/>
+        </w:rPr>
+        <w:t>Sep 2026</w:t>
+      </w:r>
+    </w:p>
+    <w:p>
+      <w:pPr>
         <w:spacing w:after="20"/>
-        <w:ind w:left="360" w:hanging="360"/>
-        <w:rPr>
-          <w:sz w:val="20"/>
-          <w:szCs w:val="24"/>
-        </w:rPr>
-      </w:pPr>
+        <w:rPr>
+          <w:sz w:val="20"/>
+          <w:szCs w:val="24"/>
+        </w:rPr>
+      </w:pPr>
+      <w:proofErr w:type="spellStart"/>
       <w:r>
         <w:rPr>
           <w:b/>
           <w:bCs/>
-          <w:sz w:val="20"/>
-          <w:szCs w:val="24"/>
-        </w:rPr>
-        <w:t>Computer Vision — Industrial Monitoring System (Client Project)</w:t>
+          <w:iCs/>
+          <w:color w:val="auto"/>
+          <w:sz w:val="22"/>
+          <w:szCs w:val="28"/>
+        </w:rPr>
+        <w:t>Difinity</w:t>
+      </w:r>
+      <w:proofErr w:type="spellEnd"/>
+      <w:r>
+        <w:rPr>
+          <w:b/>
+          <w:bCs/>
+          <w:iCs/>
+          <w:color w:val="auto"/>
+          <w:sz w:val="22"/>
+          <w:szCs w:val="28"/>
+        </w:rPr>
+        <w:t xml:space="preserve"> Digital LLP</w:t>
+      </w:r>
+      <w:r>
+        <w:rPr>
+          <w:b/>
+          <w:bCs/>
+          <w:i/>
+          <w:color w:val="555555"/>
+          <w:sz w:val="20"/>
+          <w:szCs w:val="24"/>
+        </w:rPr>
+        <w:t xml:space="preserve">                                                                                                                                                                    </w:t>
+      </w:r>
+      <w:r>
+        <w:rPr>
+          <w:b/>
+          <w:bCs/>
+          <w:i/>
+          <w:color w:val="555555"/>
+          <w:sz w:val="20"/>
+          <w:szCs w:val="24"/>
+        </w:rPr>
+        <w:t>Kochi, Kerala</w:t>
       </w:r>
     </w:p>
     <w:p>
       <w:pPr>
         <w:pStyle w:val="ListBullet"/>
-        <w:numPr>
-          <w:ilvl w:val="0"/>
-          <w:numId w:val="11"/>
-        </w:numPr>
         <w:tabs>
-          <w:tab w:val="clear" w:pos="720"/>
-          <w:tab w:val="num" w:pos="360"/>
+          <w:tab w:val="clear" w:pos="360"/>
+          <w:tab w:val="num" w:pos="142"/>
         </w:tabs>
         <w:spacing w:after="20"/>
         <w:ind w:left="142" w:hanging="142"/>
@@ -809,19 +1423,29 @@
         <w:rPr>
           <w:lang w:val="en-IN" w:eastAsia="en-IN"/>
         </w:rPr>
-        <w:t>Delivered production Computer Vision solutions across 2 sprints for a real-world client project focused on industrial monitoring and automation.</w:t>
+        <w:t xml:space="preserve">Developed </w:t>
+      </w:r>
+      <w:r>
+        <w:rPr>
+          <w:b/>
+          <w:bCs/>
+          <w:lang w:val="en-IN" w:eastAsia="en-IN"/>
+        </w:rPr>
+        <w:t>YOLOv26</w:t>
+      </w:r>
+      <w:r>
+        <w:rPr>
+          <w:lang w:val="en-IN" w:eastAsia="en-IN"/>
+        </w:rPr>
+        <w:t xml:space="preserve"> object detection and segmentation pipelines for industrial monitoring use cases, including sack detection, conveyor belt tracking, static object monitoring, and zone-based activity detection.</w:t>
       </w:r>
     </w:p>
     <w:p>
       <w:pPr>
         <w:pStyle w:val="ListBullet"/>
-        <w:numPr>
-          <w:ilvl w:val="0"/>
-          <w:numId w:val="11"/>
-        </w:numPr>
         <w:tabs>
-          <w:tab w:val="clear" w:pos="720"/>
-          <w:tab w:val="num" w:pos="360"/>
+          <w:tab w:val="clear" w:pos="360"/>
+          <w:tab w:val="num" w:pos="142"/>
         </w:tabs>
         <w:spacing w:after="20"/>
         <w:ind w:left="142" w:hanging="142"/>
@@ -831,294 +1455,73 @@
       </w:pPr>
       <w:r>
         <w:rPr>
+          <w:lang w:val="en-IN" w:eastAsia="en-IN"/>
+        </w:rPr>
+        <w:lastRenderedPageBreak/>
+        <w:t xml:space="preserve">Benchmarked YOLOv26 Nano, Small, Medium, and </w:t>
+      </w:r>
+      <w:proofErr w:type="gramStart"/>
+      <w:r>
+        <w:rPr>
+          <w:lang w:val="en-IN" w:eastAsia="en-IN"/>
+        </w:rPr>
+        <w:t>Large</w:t>
+      </w:r>
+      <w:proofErr w:type="gramEnd"/>
+      <w:r>
+        <w:rPr>
+          <w:lang w:val="en-IN" w:eastAsia="en-IN"/>
+        </w:rPr>
+        <w:t xml:space="preserve"> variants, evaluating accuracy-latency trade-offs to identify suitable deployment configurations.</w:t>
+      </w:r>
+    </w:p>
+    <w:p>
+      <w:pPr>
+        <w:pStyle w:val="ListBullet"/>
+        <w:tabs>
+          <w:tab w:val="clear" w:pos="360"/>
+          <w:tab w:val="num" w:pos="142"/>
+        </w:tabs>
+        <w:spacing w:after="20"/>
+        <w:ind w:left="142" w:hanging="142"/>
+        <w:rPr>
+          <w:lang w:val="en-IN" w:eastAsia="en-IN"/>
+        </w:rPr>
+      </w:pPr>
+      <w:r>
+        <w:rPr>
+          <w:lang w:val="en-IN" w:eastAsia="en-IN"/>
+        </w:rPr>
+        <w:t>Integrated Meta's Segment Anything Model (</w:t>
+      </w:r>
+      <w:r>
+        <w:rPr>
           <w:b/>
           <w:bCs/>
           <w:lang w:val="en-IN" w:eastAsia="en-IN"/>
         </w:rPr>
-        <w:t>Sprint 1:</w:t>
+        <w:t>SAM</w:t>
       </w:r>
       <w:r>
         <w:rPr>
           <w:lang w:val="en-IN" w:eastAsia="en-IN"/>
         </w:rPr>
-        <w:t> Built object detection pipelines using YOLOv26 models (Nano, Small, Medium, Large variants) for use cases including sack detection, conveyor belt movement detection, and static time monitoring.</w:t>
-      </w:r>
-    </w:p>
-    <w:p>
-      <w:pPr>
-        <w:pStyle w:val="ListBullet"/>
-        <w:numPr>
-          <w:ilvl w:val="0"/>
-          <w:numId w:val="11"/>
-        </w:numPr>
-        <w:tabs>
-          <w:tab w:val="clear" w:pos="720"/>
-          <w:tab w:val="num" w:pos="360"/>
-        </w:tabs>
-        <w:spacing w:after="20"/>
-        <w:ind w:left="142" w:hanging="142"/>
+        <w:t xml:space="preserve">) into Label Studio through a custom backend, enabling one-click segmentation annotation and streamlining data </w:t>
+      </w:r>
+      <w:proofErr w:type="spellStart"/>
+      <w:r>
         <w:rPr>
           <w:lang w:val="en-IN" w:eastAsia="en-IN"/>
         </w:rPr>
-      </w:pPr>
-      <w:r>
-        <w:rPr>
-          <w:b/>
-          <w:bCs/>
+        <w:t>labeling</w:t>
+      </w:r>
+      <w:proofErr w:type="spellEnd"/>
+      <w:r>
+        <w:rPr>
           <w:lang w:val="en-IN" w:eastAsia="en-IN"/>
         </w:rPr>
-        <w:t>Sprint 2:</w:t>
-      </w:r>
-      <w:r>
-        <w:rPr>
-          <w:lang w:val="en-IN" w:eastAsia="en-IN"/>
-        </w:rPr>
-        <w:t xml:space="preserve"> Migrated the pipeline from detection to YOLOv26-Seg segmentation models, benchmarked multiple model variants for accuracy-latency </w:t>
-      </w:r>
-      <w:proofErr w:type="spellStart"/>
-      <w:r>
-        <w:rPr>
-          <w:lang w:val="en-IN" w:eastAsia="en-IN"/>
-        </w:rPr>
-        <w:t>tradeoffs</w:t>
-      </w:r>
-      <w:proofErr w:type="spellEnd"/>
-      <w:r>
-        <w:rPr>
-          <w:lang w:val="en-IN" w:eastAsia="en-IN"/>
-        </w:rPr>
-        <w:t>, and selected optimal configurations for production deployment.</w:t>
-      </w:r>
-    </w:p>
-    <w:p>
-      <w:pPr>
-        <w:pStyle w:val="ListBullet"/>
-        <w:numPr>
-          <w:ilvl w:val="0"/>
-          <w:numId w:val="11"/>
-        </w:numPr>
-        <w:tabs>
-          <w:tab w:val="clear" w:pos="720"/>
-          <w:tab w:val="num" w:pos="360"/>
-        </w:tabs>
-        <w:spacing w:after="20"/>
-        <w:ind w:left="142" w:hanging="142"/>
-        <w:rPr>
-          <w:lang w:val="en-IN" w:eastAsia="en-IN"/>
-        </w:rPr>
-      </w:pPr>
-      <w:r>
-        <w:rPr>
-          <w:lang w:val="en-IN" w:eastAsia="en-IN"/>
-        </w:rPr>
-        <w:t>Integrated Meta's </w:t>
-      </w:r>
-      <w:r>
-        <w:rPr>
-          <w:b/>
-          <w:bCs/>
-          <w:lang w:val="en-IN" w:eastAsia="en-IN"/>
-        </w:rPr>
-        <w:t>SAM (Segment Anything Model) into Label Studio</w:t>
-      </w:r>
-      <w:r>
-        <w:rPr>
-          <w:lang w:val="en-IN" w:eastAsia="en-IN"/>
-        </w:rPr>
-        <w:t xml:space="preserve">, building a custom backend that enabled one-click segmentation </w:t>
-      </w:r>
-      <w:proofErr w:type="spellStart"/>
-      <w:r>
-        <w:rPr>
-          <w:lang w:val="en-IN" w:eastAsia="en-IN"/>
-        </w:rPr>
-        <w:t>labeling</w:t>
-      </w:r>
-      <w:proofErr w:type="spellEnd"/>
-      <w:r>
-        <w:rPr>
-          <w:lang w:val="en-IN" w:eastAsia="en-IN"/>
-        </w:rPr>
-        <w:t xml:space="preserve"> — significantly reducing annotation time for the data </w:t>
-      </w:r>
-      <w:proofErr w:type="spellStart"/>
-      <w:r>
-        <w:rPr>
-          <w:lang w:val="en-IN" w:eastAsia="en-IN"/>
-        </w:rPr>
-        <w:t>labeling</w:t>
-      </w:r>
-      <w:proofErr w:type="spellEnd"/>
-      <w:r>
-        <w:rPr>
-          <w:lang w:val="en-IN" w:eastAsia="en-IN"/>
-        </w:rPr>
-        <w:t xml:space="preserve"> team.</w:t>
-      </w:r>
-    </w:p>
-    <w:p>
-      <w:pPr>
-        <w:pStyle w:val="ListBullet"/>
-        <w:numPr>
-          <w:ilvl w:val="0"/>
-          <w:numId w:val="11"/>
-        </w:numPr>
-        <w:tabs>
-          <w:tab w:val="clear" w:pos="720"/>
-          <w:tab w:val="num" w:pos="360"/>
-        </w:tabs>
-        <w:spacing w:after="20"/>
-        <w:ind w:left="142" w:hanging="142"/>
-        <w:rPr>
-          <w:lang w:val="en-IN" w:eastAsia="en-IN"/>
-        </w:rPr>
-      </w:pPr>
-      <w:r>
-        <w:rPr>
-          <w:lang w:val="en-IN" w:eastAsia="en-IN"/>
-        </w:rPr>
-        <w:t>Engineered solutions for multiple industrial use cases: sack counting, belt movement tracking, static object duration monitoring, and zone-based activity detection.</w:t>
-      </w:r>
-    </w:p>
-    <w:p>
-      <w:pPr>
-        <w:pStyle w:val="ListBullet"/>
-        <w:numPr>
-          <w:ilvl w:val="0"/>
-          <w:numId w:val="0"/>
-        </w:numPr>
-        <w:spacing w:after="20"/>
-        <w:ind w:left="360" w:hanging="360"/>
-        <w:rPr>
-          <w:sz w:val="2"/>
-          <w:szCs w:val="2"/>
-          <w:lang w:val="en-IN" w:eastAsia="en-IN"/>
-        </w:rPr>
-      </w:pPr>
-    </w:p>
-    <w:p>
-      <w:pPr>
-        <w:pStyle w:val="ListBullet"/>
-        <w:numPr>
-          <w:ilvl w:val="0"/>
-          <w:numId w:val="0"/>
-        </w:numPr>
-        <w:spacing w:after="20"/>
-        <w:ind w:left="360" w:hanging="360"/>
-        <w:rPr>
-          <w:b/>
-          <w:bCs/>
-          <w:lang w:eastAsia="en-IN"/>
-        </w:rPr>
-      </w:pPr>
-      <w:r>
-        <w:rPr>
-          <w:b/>
-          <w:bCs/>
-          <w:lang w:eastAsia="en-IN"/>
-        </w:rPr>
-        <w:t>Generative AI &amp; Backend Engineering</w:t>
-      </w:r>
-    </w:p>
-    <w:p>
-      <w:pPr>
-        <w:pStyle w:val="ListBullet"/>
-        <w:numPr>
-          <w:ilvl w:val="0"/>
-          <w:numId w:val="12"/>
-        </w:numPr>
-        <w:tabs>
-          <w:tab w:val="clear" w:pos="720"/>
-          <w:tab w:val="num" w:pos="142"/>
-        </w:tabs>
-        <w:spacing w:after="20"/>
-        <w:ind w:hanging="720"/>
-        <w:rPr>
-          <w:lang w:val="en-IN" w:eastAsia="en-IN"/>
-        </w:rPr>
-      </w:pPr>
-      <w:r>
-        <w:rPr>
-          <w:lang w:val="en-IN" w:eastAsia="en-IN"/>
-        </w:rPr>
-        <w:t xml:space="preserve">Developed AI-powered backend services using Python, </w:t>
-      </w:r>
-      <w:proofErr w:type="spellStart"/>
-      <w:r>
-        <w:rPr>
-          <w:lang w:val="en-IN" w:eastAsia="en-IN"/>
-        </w:rPr>
-        <w:t>FastAPI</w:t>
-      </w:r>
-      <w:proofErr w:type="spellEnd"/>
-      <w:r>
-        <w:rPr>
-          <w:lang w:val="en-IN" w:eastAsia="en-IN"/>
-        </w:rPr>
-        <w:t>, and REST APIs for client-facing deployments.</w:t>
-      </w:r>
-    </w:p>
-    <w:p>
-      <w:pPr>
-        <w:pStyle w:val="ListBullet"/>
-        <w:numPr>
-          <w:ilvl w:val="0"/>
-          <w:numId w:val="12"/>
-        </w:numPr>
-        <w:tabs>
-          <w:tab w:val="clear" w:pos="720"/>
-          <w:tab w:val="num" w:pos="142"/>
-        </w:tabs>
-        <w:spacing w:after="20"/>
-        <w:ind w:hanging="720"/>
-        <w:rPr>
-          <w:lang w:val="en-IN" w:eastAsia="en-IN"/>
-        </w:rPr>
-      </w:pPr>
-      <w:r>
-        <w:rPr>
-          <w:lang w:val="en-IN" w:eastAsia="en-IN"/>
-        </w:rPr>
-        <w:t>Built LLM-based workflow automation and Generative AI integrations for internal tooling and client applications.</w:t>
-      </w:r>
-    </w:p>
-    <w:p>
-      <w:pPr>
-        <w:pStyle w:val="ListBullet"/>
-        <w:numPr>
-          <w:ilvl w:val="0"/>
-          <w:numId w:val="12"/>
-        </w:numPr>
-        <w:tabs>
-          <w:tab w:val="clear" w:pos="720"/>
-          <w:tab w:val="num" w:pos="142"/>
-        </w:tabs>
-        <w:spacing w:after="20"/>
-        <w:ind w:hanging="720"/>
-        <w:rPr>
-          <w:lang w:val="en-IN" w:eastAsia="en-IN"/>
-        </w:rPr>
-      </w:pPr>
-      <w:r>
-        <w:rPr>
-          <w:lang w:val="en-IN" w:eastAsia="en-IN"/>
-        </w:rPr>
-        <w:t>Collaborated with cross-functional engineering teams on architecture decisions, code reviews, and sprint planning.</w:t>
-      </w:r>
-    </w:p>
-    <w:p>
-      <w:pPr>
-        <w:pStyle w:val="ListBullet"/>
-        <w:numPr>
-          <w:ilvl w:val="0"/>
-          <w:numId w:val="0"/>
-        </w:numPr>
-        <w:spacing w:after="20"/>
-        <w:rPr>
-          <w:sz w:val="2"/>
-          <w:szCs w:val="2"/>
-        </w:rPr>
-      </w:pPr>
+        <w:t xml:space="preserve"> workflows.</w:t>
+      </w:r>
     </w:p>
     <w:p>
       <w:pPr>
@@ -1318,16 +1721,173 @@
     </w:p>
     <w:p>
       <w:pPr>
-        <w:pStyle w:val="ListBullet"/>
+        <w:pStyle w:val="ListParagraph"/>
         <w:numPr>
           <w:ilvl w:val="0"/>
-          <w:numId w:val="13"/>
+          <w:numId w:val="21"/>
+        </w:numPr>
+        <w:spacing w:after="40"/>
+        <w:ind w:left="142" w:hanging="142"/>
+        <w:rPr>
+          <w:color w:val="2A2A2A"/>
+          <w:sz w:val="20"/>
+          <w:szCs w:val="24"/>
+          <w:lang w:val="en-IN"/>
+        </w:rPr>
+      </w:pPr>
+      <w:r>
+        <w:rPr>
+          <w:color w:val="2A2A2A"/>
+          <w:sz w:val="20"/>
+          <w:szCs w:val="24"/>
+          <w:lang w:val="en-IN"/>
+        </w:rPr>
+        <w:t xml:space="preserve">Developed a multi-session AI playground for evaluating LLM responses with configurable inference parameters, including temperature, </w:t>
+      </w:r>
+      <w:proofErr w:type="spellStart"/>
+      <w:r>
+        <w:rPr>
+          <w:color w:val="2A2A2A"/>
+          <w:sz w:val="20"/>
+          <w:szCs w:val="24"/>
+          <w:lang w:val="en-IN"/>
+        </w:rPr>
+        <w:t>top_p</w:t>
+      </w:r>
+      <w:proofErr w:type="spellEnd"/>
+      <w:r>
+        <w:rPr>
+          <w:color w:val="2A2A2A"/>
+          <w:sz w:val="20"/>
+          <w:szCs w:val="24"/>
+          <w:lang w:val="en-IN"/>
+        </w:rPr>
+        <w:t xml:space="preserve">, </w:t>
+      </w:r>
+      <w:proofErr w:type="spellStart"/>
+      <w:r>
+        <w:rPr>
+          <w:color w:val="2A2A2A"/>
+          <w:sz w:val="20"/>
+          <w:szCs w:val="24"/>
+          <w:lang w:val="en-IN"/>
+        </w:rPr>
+        <w:t>max_tokens</w:t>
+      </w:r>
+      <w:proofErr w:type="spellEnd"/>
+      <w:r>
+        <w:rPr>
+          <w:color w:val="2A2A2A"/>
+          <w:sz w:val="20"/>
+          <w:szCs w:val="24"/>
+          <w:lang w:val="en-IN"/>
+        </w:rPr>
+        <w:t>, and system prompts.</w:t>
+      </w:r>
+    </w:p>
+    <w:p>
+      <w:pPr>
+        <w:pStyle w:val="ListParagraph"/>
+        <w:numPr>
+          <w:ilvl w:val="0"/>
+          <w:numId w:val="21"/>
+        </w:numPr>
+        <w:spacing w:after="40"/>
+        <w:ind w:left="142" w:hanging="142"/>
+        <w:rPr>
+          <w:color w:val="2A2A2A"/>
+          <w:sz w:val="20"/>
+          <w:szCs w:val="24"/>
+          <w:lang w:val="en-IN"/>
+        </w:rPr>
+      </w:pPr>
+      <w:r>
+        <w:rPr>
+          <w:color w:val="2A2A2A"/>
+          <w:sz w:val="20"/>
+          <w:szCs w:val="24"/>
+          <w:lang w:val="en-IN"/>
+        </w:rPr>
+        <w:t>Implemented real-time SSE streaming for interactive model evaluation and engineered an OpenAI-compatible API gateway with Bearer token authentication, structured logging, and monitoring across 40+ standardized API endpoints.</w:t>
+      </w:r>
+    </w:p>
+    <w:p>
+      <w:pPr>
+        <w:pStyle w:val="ListParagraph"/>
+        <w:numPr>
+          <w:ilvl w:val="0"/>
+          <w:numId w:val="21"/>
+        </w:numPr>
+        <w:spacing w:after="40"/>
+        <w:ind w:left="142" w:hanging="142"/>
+        <w:rPr>
+          <w:color w:val="2A2A2A"/>
+          <w:sz w:val="20"/>
+          <w:szCs w:val="24"/>
+          <w:lang w:val="en-IN"/>
+        </w:rPr>
+      </w:pPr>
+      <w:r>
+        <w:rPr>
+          <w:color w:val="2A2A2A"/>
+          <w:sz w:val="20"/>
+          <w:szCs w:val="24"/>
+          <w:lang w:val="en-IN"/>
+        </w:rPr>
+        <w:t xml:space="preserve">Developing a </w:t>
+      </w:r>
+      <w:r>
+        <w:rPr>
+          <w:b/>
+          <w:bCs/>
+          <w:color w:val="2A2A2A"/>
+          <w:sz w:val="20"/>
+          <w:szCs w:val="24"/>
+          <w:lang w:val="en-IN"/>
+        </w:rPr>
+        <w:t>RAG</w:t>
+      </w:r>
+      <w:r>
+        <w:rPr>
+          <w:color w:val="2A2A2A"/>
+          <w:sz w:val="20"/>
+          <w:szCs w:val="24"/>
+          <w:lang w:val="en-IN"/>
+        </w:rPr>
+        <w:t xml:space="preserve"> pipeline for PDF and Markdown ingestion, text chunking, embedding integration, and </w:t>
+      </w:r>
+      <w:proofErr w:type="spellStart"/>
+      <w:r>
+        <w:rPr>
+          <w:color w:val="2A2A2A"/>
+          <w:sz w:val="20"/>
+          <w:szCs w:val="24"/>
+          <w:lang w:val="en-IN"/>
+        </w:rPr>
+        <w:t>pgvector</w:t>
+      </w:r>
+      <w:proofErr w:type="spellEnd"/>
+      <w:r>
+        <w:rPr>
+          <w:color w:val="2A2A2A"/>
+          <w:sz w:val="20"/>
+          <w:szCs w:val="24"/>
+          <w:lang w:val="en-IN"/>
+        </w:rPr>
+        <w:t>-based semantic retrieval to evaluate different embedding and retrieval configurations.</w:t>
+      </w:r>
+    </w:p>
+    <w:p>
+      <w:pPr>
+        <w:pStyle w:val="ListParagraph"/>
+        <w:numPr>
+          <w:ilvl w:val="0"/>
+          <w:numId w:val="21"/>
         </w:numPr>
         <w:tabs>
-          <w:tab w:val="clear" w:pos="720"/>
-          <w:tab w:val="num" w:pos="284"/>
+          <w:tab w:val="right" w:pos="10205"/>
         </w:tabs>
-        <w:spacing w:after="20"/>
+        <w:spacing w:before="60"/>
         <w:ind w:left="142" w:hanging="142"/>
         <w:rPr>
           <w:color w:val="2A2A2A"/>
@@ -1343,309 +1903,7 @@
           <w:szCs w:val="24"/>
           <w:lang w:val="en-IN"/>
         </w:rPr>
-        <w:t>Building a comprehensive AI model evaluation platform to test, compare, and benchmark LLMs across multiple providers (</w:t>
-      </w:r>
-      <w:proofErr w:type="spellStart"/>
-      <w:proofErr w:type="gramStart"/>
-      <w:r>
-        <w:rPr>
-          <w:color w:val="2A2A2A"/>
-          <w:sz w:val="20"/>
-          <w:szCs w:val="24"/>
-          <w:lang w:val="en-IN"/>
-        </w:rPr>
-        <w:t>Nvid</w:t>
-      </w:r>
-      <w:r>
-        <w:rPr>
-          <w:color w:val="2A2A2A"/>
-          <w:sz w:val="20"/>
-          <w:szCs w:val="24"/>
-          <w:lang w:val="en-IN"/>
-        </w:rPr>
-        <w:t>ia,Huggingface</w:t>
-      </w:r>
-      <w:proofErr w:type="spellEnd"/>
-      <w:proofErr w:type="gramEnd"/>
-      <w:r>
-        <w:rPr>
-          <w:color w:val="2A2A2A"/>
-          <w:sz w:val="20"/>
-          <w:szCs w:val="24"/>
-          <w:lang w:val="en-IN"/>
-        </w:rPr>
-        <w:t xml:space="preserve">) with planned support for </w:t>
-      </w:r>
-      <w:proofErr w:type="gramStart"/>
-      <w:r>
-        <w:rPr>
-          <w:color w:val="2A2A2A"/>
-          <w:sz w:val="20"/>
-          <w:szCs w:val="24"/>
-          <w:lang w:val="en-IN"/>
-        </w:rPr>
-        <w:t>locally-hosted</w:t>
-      </w:r>
-      <w:proofErr w:type="gramEnd"/>
-      <w:r>
-        <w:rPr>
-          <w:color w:val="2A2A2A"/>
-          <w:sz w:val="20"/>
-          <w:szCs w:val="24"/>
-          <w:lang w:val="en-IN"/>
-        </w:rPr>
-        <w:t xml:space="preserve"> models (Llama 3, DeepSeek) via </w:t>
-      </w:r>
-      <w:proofErr w:type="spellStart"/>
-      <w:r>
-        <w:rPr>
-          <w:color w:val="2A2A2A"/>
-          <w:sz w:val="20"/>
-          <w:szCs w:val="24"/>
-          <w:lang w:val="en-IN"/>
-        </w:rPr>
-        <w:t>Ollama</w:t>
-      </w:r>
-      <w:proofErr w:type="spellEnd"/>
-      <w:r>
-        <w:rPr>
-          <w:color w:val="2A2A2A"/>
-          <w:sz w:val="20"/>
-          <w:szCs w:val="24"/>
-          <w:lang w:val="en-IN"/>
-        </w:rPr>
-        <w:t>/</w:t>
-      </w:r>
-      <w:proofErr w:type="spellStart"/>
-      <w:r>
-        <w:rPr>
-          <w:color w:val="2A2A2A"/>
-          <w:sz w:val="20"/>
-          <w:szCs w:val="24"/>
-          <w:lang w:val="en-IN"/>
-        </w:rPr>
-        <w:t>vLLM</w:t>
-      </w:r>
-      <w:proofErr w:type="spellEnd"/>
-      <w:r>
-        <w:rPr>
-          <w:color w:val="2A2A2A"/>
-          <w:sz w:val="20"/>
-          <w:szCs w:val="24"/>
-          <w:lang w:val="en-IN"/>
-        </w:rPr>
-        <w:t>.</w:t>
-      </w:r>
-    </w:p>
-    <w:p>
-      <w:pPr>
-        <w:pStyle w:val="ListBullet"/>
-        <w:numPr>
-          <w:ilvl w:val="0"/>
-          <w:numId w:val="13"/>
-        </w:numPr>
-        <w:tabs>
-          <w:tab w:val="clear" w:pos="720"/>
-          <w:tab w:val="num" w:pos="284"/>
-        </w:tabs>
-        <w:spacing w:after="20"/>
-        <w:ind w:left="142" w:hanging="142"/>
-        <w:rPr>
-          <w:color w:val="2A2A2A"/>
-          <w:sz w:val="20"/>
-          <w:szCs w:val="24"/>
-          <w:lang w:val="en-IN"/>
-        </w:rPr>
-      </w:pPr>
-      <w:r>
-        <w:rPr>
-          <w:color w:val="2A2A2A"/>
-          <w:sz w:val="20"/>
-          <w:szCs w:val="24"/>
-          <w:lang w:val="en-IN"/>
-        </w:rPr>
-        <w:lastRenderedPageBreak/>
-        <w:t xml:space="preserve">Engineered a multi-session AI playground with configurable inference parameters (temperature, </w:t>
-      </w:r>
-      <w:proofErr w:type="spellStart"/>
-      <w:r>
-        <w:rPr>
-          <w:color w:val="2A2A2A"/>
-          <w:sz w:val="20"/>
-          <w:szCs w:val="24"/>
-          <w:lang w:val="en-IN"/>
-        </w:rPr>
-        <w:t>top_p</w:t>
-      </w:r>
-      <w:proofErr w:type="spellEnd"/>
-      <w:r>
-        <w:rPr>
-          <w:color w:val="2A2A2A"/>
-          <w:sz w:val="20"/>
-          <w:szCs w:val="24"/>
-          <w:lang w:val="en-IN"/>
-        </w:rPr>
-        <w:t xml:space="preserve">, </w:t>
-      </w:r>
-      <w:proofErr w:type="spellStart"/>
-      <w:r>
-        <w:rPr>
-          <w:color w:val="2A2A2A"/>
-          <w:sz w:val="20"/>
-          <w:szCs w:val="24"/>
-          <w:lang w:val="en-IN"/>
-        </w:rPr>
-        <w:t>max_tokens</w:t>
-      </w:r>
-      <w:proofErr w:type="spellEnd"/>
-      <w:r>
-        <w:rPr>
-          <w:color w:val="2A2A2A"/>
-          <w:sz w:val="20"/>
-          <w:szCs w:val="24"/>
-          <w:lang w:val="en-IN"/>
-        </w:rPr>
-        <w:t>, system prompts) and real-time SSE streaming for interactive response evaluation.</w:t>
-      </w:r>
-    </w:p>
-    <w:p>
-      <w:pPr>
-        <w:pStyle w:val="ListBullet"/>
-        <w:numPr>
-          <w:ilvl w:val="0"/>
-          <w:numId w:val="13"/>
-        </w:numPr>
-        <w:tabs>
-          <w:tab w:val="clear" w:pos="720"/>
-          <w:tab w:val="num" w:pos="284"/>
-        </w:tabs>
-        <w:spacing w:after="20"/>
-        <w:ind w:left="142" w:hanging="142"/>
-        <w:rPr>
-          <w:color w:val="2A2A2A"/>
-          <w:sz w:val="20"/>
-          <w:szCs w:val="24"/>
-          <w:lang w:val="en-IN"/>
-        </w:rPr>
-      </w:pPr>
-      <w:r>
-        <w:rPr>
-          <w:color w:val="2A2A2A"/>
-          <w:sz w:val="20"/>
-          <w:szCs w:val="24"/>
-          <w:lang w:val="en-IN"/>
-        </w:rPr>
-        <w:t xml:space="preserve">Building a RAG pipeline with PDF/Markdown document ingestion, text chunking, embedding model integration, and </w:t>
-      </w:r>
-      <w:proofErr w:type="spellStart"/>
-      <w:r>
-        <w:rPr>
-          <w:color w:val="2A2A2A"/>
-          <w:sz w:val="20"/>
-          <w:szCs w:val="24"/>
-          <w:lang w:val="en-IN"/>
-        </w:rPr>
-        <w:t>pgvector</w:t>
-      </w:r>
-      <w:proofErr w:type="spellEnd"/>
-      <w:r>
-        <w:rPr>
-          <w:color w:val="2A2A2A"/>
-          <w:sz w:val="20"/>
-          <w:szCs w:val="24"/>
-          <w:lang w:val="en-IN"/>
-        </w:rPr>
-        <w:t>-based semantic retrieval — with support for testing different embedding and retrieval model combinations.</w:t>
-      </w:r>
-    </w:p>
-    <w:p>
-      <w:pPr>
-        <w:pStyle w:val="ListBullet"/>
-        <w:numPr>
-          <w:ilvl w:val="0"/>
-          <w:numId w:val="13"/>
-        </w:numPr>
-        <w:tabs>
-          <w:tab w:val="clear" w:pos="720"/>
-          <w:tab w:val="num" w:pos="284"/>
-        </w:tabs>
-        <w:spacing w:after="20"/>
-        <w:ind w:left="142" w:hanging="142"/>
-        <w:rPr>
-          <w:color w:val="2A2A2A"/>
-          <w:sz w:val="20"/>
-          <w:szCs w:val="24"/>
-          <w:lang w:val="en-IN"/>
-        </w:rPr>
-      </w:pPr>
-      <w:r>
-        <w:rPr>
-          <w:color w:val="2A2A2A"/>
-          <w:sz w:val="20"/>
-          <w:szCs w:val="24"/>
-          <w:lang w:val="en-IN"/>
-        </w:rPr>
-        <w:t>Architecting a graph-based multi-tier memory system (Conversation, Semantic, Long-Term) to benchmark how different memory configurations affect AI response quality and coherence.</w:t>
-      </w:r>
-    </w:p>
-    <w:p>
-      <w:pPr>
-        <w:pStyle w:val="ListBullet"/>
-        <w:numPr>
-          <w:ilvl w:val="0"/>
-          <w:numId w:val="13"/>
-        </w:numPr>
-        <w:tabs>
-          <w:tab w:val="clear" w:pos="720"/>
-          <w:tab w:val="num" w:pos="284"/>
-        </w:tabs>
-        <w:spacing w:after="20"/>
-        <w:ind w:left="142" w:hanging="142"/>
-        <w:rPr>
-          <w:color w:val="2A2A2A"/>
-          <w:sz w:val="20"/>
-          <w:szCs w:val="24"/>
-          <w:lang w:val="en-IN"/>
-        </w:rPr>
-      </w:pPr>
-      <w:r>
-        <w:rPr>
-          <w:color w:val="2A2A2A"/>
-          <w:sz w:val="20"/>
-          <w:szCs w:val="24"/>
-          <w:lang w:val="en-IN"/>
-        </w:rPr>
-        <w:t>Designing a multi-step AI workflow orchestration engine for automated LLM routing, conditional branching, and agentic workflows.</w:t>
-      </w:r>
-    </w:p>
-    <w:p>
-      <w:pPr>
-        <w:pStyle w:val="ListBullet"/>
-        <w:numPr>
-          <w:ilvl w:val="0"/>
-          <w:numId w:val="13"/>
-        </w:numPr>
-        <w:tabs>
-          <w:tab w:val="clear" w:pos="720"/>
-          <w:tab w:val="num" w:pos="284"/>
-        </w:tabs>
-        <w:spacing w:after="20"/>
-        <w:ind w:left="142" w:hanging="142"/>
-        <w:rPr>
-          <w:color w:val="2A2A2A"/>
-          <w:sz w:val="20"/>
-          <w:szCs w:val="24"/>
-          <w:lang w:val="en-IN"/>
-        </w:rPr>
-      </w:pPr>
-      <w:r>
-        <w:rPr>
-          <w:color w:val="2A2A2A"/>
-          <w:sz w:val="20"/>
-          <w:szCs w:val="24"/>
-          <w:lang w:val="en-IN"/>
-        </w:rPr>
-        <w:t>Engineered an OpenAI-compatible API gateway with Bearer token authentication, routing inference across 40+ standardized API endpoints with structured logging and monitoring.</w:t>
+        <w:t>Designing a graph-based memory architecture covering conversational, semantic, and long-term memory, alongside multi-step orchestration for LLM routing, conditional branching, and agentic workflows.</w:t>
       </w:r>
     </w:p>
     <w:p>
@@ -1822,14 +2080,6 @@
     <w:p>
       <w:pPr>
         <w:pStyle w:val="ListBullet"/>
-        <w:numPr>
-          <w:ilvl w:val="0"/>
-          <w:numId w:val="14"/>
-        </w:numPr>
-        <w:tabs>
-          <w:tab w:val="clear" w:pos="720"/>
-          <w:tab w:val="num" w:pos="284"/>
-        </w:tabs>
         <w:spacing w:after="20"/>
         <w:ind w:left="142" w:hanging="142"/>
         <w:rPr>
@@ -1846,99 +2096,8 @@
           <w:szCs w:val="24"/>
           <w:lang w:val="en-IN"/>
         </w:rPr>
-        <w:t>Developed an end-to-end hybrid deep learning framework combining YOLO-based object detection with CNN-based severity classification for automated vehicle damage assessment.</w:t>
-      </w:r>
-    </w:p>
-    <w:p>
-      <w:pPr>
-        <w:pStyle w:val="ListBullet"/>
-        <w:numPr>
-          <w:ilvl w:val="0"/>
-          <w:numId w:val="14"/>
-        </w:numPr>
-        <w:tabs>
-          <w:tab w:val="clear" w:pos="720"/>
-          <w:tab w:val="num" w:pos="284"/>
-        </w:tabs>
-        <w:spacing w:after="20"/>
-        <w:ind w:left="142" w:hanging="142"/>
-        <w:rPr>
-          <w:color w:val="2A2A2A"/>
-          <w:sz w:val="20"/>
-          <w:szCs w:val="24"/>
-          <w:lang w:val="en-IN"/>
-        </w:rPr>
-      </w:pPr>
-      <w:r>
-        <w:rPr>
-          <w:color w:val="2A2A2A"/>
-          <w:sz w:val="20"/>
-          <w:szCs w:val="24"/>
-          <w:lang w:val="en-IN"/>
-        </w:rPr>
-        <w:t>Built the complete ML pipeline: dataset curation, model training, hyperparameter optimization, evaluation metrics (</w:t>
-      </w:r>
-      <w:proofErr w:type="spellStart"/>
-      <w:r>
-        <w:rPr>
-          <w:color w:val="2A2A2A"/>
-          <w:sz w:val="20"/>
-          <w:szCs w:val="24"/>
-          <w:lang w:val="en-IN"/>
-        </w:rPr>
-        <w:t>mAP</w:t>
-      </w:r>
-      <w:proofErr w:type="spellEnd"/>
-      <w:r>
-        <w:rPr>
-          <w:color w:val="2A2A2A"/>
-          <w:sz w:val="20"/>
-          <w:szCs w:val="24"/>
-          <w:lang w:val="en-IN"/>
-        </w:rPr>
-        <w:t xml:space="preserve">, F1, precision-recall), and a </w:t>
-      </w:r>
-      <w:proofErr w:type="spellStart"/>
-      <w:r>
-        <w:rPr>
-          <w:color w:val="2A2A2A"/>
-          <w:sz w:val="20"/>
-          <w:szCs w:val="24"/>
-          <w:lang w:val="en-IN"/>
-        </w:rPr>
-        <w:t>FastAPI</w:t>
-      </w:r>
-      <w:proofErr w:type="spellEnd"/>
-      <w:r>
-        <w:rPr>
-          <w:color w:val="2A2A2A"/>
-          <w:sz w:val="20"/>
-          <w:szCs w:val="24"/>
-          <w:lang w:val="en-IN"/>
-        </w:rPr>
-        <w:t xml:space="preserve"> inference backend for real-time predictions.</w:t>
-      </w:r>
-    </w:p>
-    <w:p>
-      <w:pPr>
-        <w:pStyle w:val="ListBullet"/>
-        <w:numPr>
-          <w:ilvl w:val="0"/>
-          <w:numId w:val="14"/>
-        </w:numPr>
-        <w:tabs>
-          <w:tab w:val="clear" w:pos="720"/>
-          <w:tab w:val="num" w:pos="284"/>
-        </w:tabs>
-        <w:spacing w:after="20"/>
-        <w:ind w:left="142" w:hanging="142"/>
-        <w:rPr>
-          <w:color w:val="2A2A2A"/>
-          <w:sz w:val="20"/>
-          <w:szCs w:val="24"/>
-          <w:lang w:val="en-IN"/>
-        </w:rPr>
-      </w:pPr>
+        <w:t xml:space="preserve">Developed a </w:t>
+      </w:r>
       <w:r>
         <w:rPr>
           <w:b/>
@@ -1948,7 +2107,7 @@
           <w:szCs w:val="24"/>
           <w:lang w:val="en-IN"/>
         </w:rPr>
-        <w:t>Presented and published</w:t>
+        <w:t>hybrid deep learning</w:t>
       </w:r>
       <w:r>
         <w:rPr>
@@ -1957,7 +2116,131 @@
           <w:szCs w:val="24"/>
           <w:lang w:val="en-IN"/>
         </w:rPr>
-        <w:t> at the 2026 IEEE International Conference on Natural Language Processing and Computer Vision (ICNPCV), Bengaluru, India.</w:t>
+        <w:t xml:space="preserve"> framework combining </w:t>
+      </w:r>
+      <w:r>
+        <w:rPr>
+          <w:b/>
+          <w:bCs/>
+          <w:color w:val="2A2A2A"/>
+          <w:sz w:val="20"/>
+          <w:szCs w:val="24"/>
+          <w:lang w:val="en-IN"/>
+        </w:rPr>
+        <w:t>YOLO</w:t>
+      </w:r>
+      <w:r>
+        <w:rPr>
+          <w:color w:val="2A2A2A"/>
+          <w:sz w:val="20"/>
+          <w:szCs w:val="24"/>
+          <w:lang w:val="en-IN"/>
+        </w:rPr>
+        <w:t xml:space="preserve">-based object detection with </w:t>
+      </w:r>
+      <w:r>
+        <w:rPr>
+          <w:b/>
+          <w:bCs/>
+          <w:color w:val="2A2A2A"/>
+          <w:sz w:val="20"/>
+          <w:szCs w:val="24"/>
+          <w:lang w:val="en-IN"/>
+        </w:rPr>
+        <w:t>CNN</w:t>
+      </w:r>
+      <w:r>
+        <w:rPr>
+          <w:color w:val="2A2A2A"/>
+          <w:sz w:val="20"/>
+          <w:szCs w:val="24"/>
+          <w:lang w:val="en-IN"/>
+        </w:rPr>
+        <w:t>-based severity classification for automated vehicle damage localization and severity assessment.</w:t>
+      </w:r>
+    </w:p>
+    <w:p>
+      <w:pPr>
+        <w:pStyle w:val="ListBullet"/>
+        <w:spacing w:after="20"/>
+        <w:ind w:left="142" w:hanging="142"/>
+        <w:rPr>
+          <w:color w:val="2A2A2A"/>
+          <w:sz w:val="20"/>
+          <w:szCs w:val="24"/>
+          <w:lang w:val="en-IN"/>
+        </w:rPr>
+      </w:pPr>
+      <w:r>
+        <w:rPr>
+          <w:color w:val="2A2A2A"/>
+          <w:sz w:val="20"/>
+          <w:szCs w:val="24"/>
+          <w:lang w:val="en-IN"/>
+        </w:rPr>
+        <w:t xml:space="preserve">Built an end-to-end machine learning pipeline covering dataset preparation, model training, hyperparameter optimization, and evaluation using </w:t>
+      </w:r>
+      <w:proofErr w:type="spellStart"/>
+      <w:r>
+        <w:rPr>
+          <w:color w:val="2A2A2A"/>
+          <w:sz w:val="20"/>
+          <w:szCs w:val="24"/>
+          <w:lang w:val="en-IN"/>
+        </w:rPr>
+        <w:t>mAP</w:t>
+      </w:r>
+      <w:proofErr w:type="spellEnd"/>
+      <w:r>
+        <w:rPr>
+          <w:color w:val="2A2A2A"/>
+          <w:sz w:val="20"/>
+          <w:szCs w:val="24"/>
+          <w:lang w:val="en-IN"/>
+        </w:rPr>
+        <w:t>, F1-score, precision, and recall.</w:t>
+      </w:r>
+    </w:p>
+    <w:p>
+      <w:pPr>
+        <w:pStyle w:val="ListBullet"/>
+        <w:spacing w:after="20"/>
+        <w:ind w:left="142" w:hanging="142"/>
+        <w:rPr>
+          <w:color w:val="2A2A2A"/>
+          <w:sz w:val="20"/>
+          <w:szCs w:val="24"/>
+          <w:lang w:val="en-IN"/>
+        </w:rPr>
+      </w:pPr>
+      <w:r>
+        <w:rPr>
+          <w:color w:val="2A2A2A"/>
+          <w:sz w:val="20"/>
+          <w:szCs w:val="24"/>
+          <w:lang w:val="en-IN"/>
+        </w:rPr>
+        <w:t xml:space="preserve">Developed a </w:t>
+      </w:r>
+      <w:proofErr w:type="spellStart"/>
+      <w:r>
+        <w:rPr>
+          <w:color w:val="2A2A2A"/>
+          <w:sz w:val="20"/>
+          <w:szCs w:val="24"/>
+          <w:lang w:val="en-IN"/>
+        </w:rPr>
+        <w:t>FastAPI</w:t>
+      </w:r>
+      <w:proofErr w:type="spellEnd"/>
+      <w:r>
+        <w:rPr>
+          <w:color w:val="2A2A2A"/>
+          <w:sz w:val="20"/>
+          <w:szCs w:val="24"/>
+          <w:lang w:val="en-IN"/>
+        </w:rPr>
+        <w:t xml:space="preserve"> inference backend to support automated vehicle damage predictions.</w:t>
       </w:r>
     </w:p>
     <w:p>
@@ -1977,94 +2260,89 @@
     </w:p>
     <w:p>
       <w:pPr>
-        <w:tabs>
-          <w:tab w:val="right" w:pos="10205"/>
-        </w:tabs>
-        <w:spacing w:before="60"/>
-        <w:rPr>
+        <w:pBdr>
+          <w:bottom w:val="single" w:sz="4" w:space="1" w:color="CCCCCC"/>
+        </w:pBdr>
+        <w:spacing w:before="120" w:after="60"/>
+        <w:rPr>
+          <w:sz w:val="20"/>
+          <w:szCs w:val="24"/>
+        </w:rPr>
+      </w:pPr>
+      <w:r>
+        <w:rPr>
+          <w:b/>
+          <w:color w:val="0D0D0D"/>
+          <w:sz w:val="22"/>
+          <w:szCs w:val="24"/>
+        </w:rPr>
+        <w:t>PUBLICATIONS</w:t>
+      </w:r>
+    </w:p>
+    <w:p>
+      <w:pPr>
+        <w:spacing w:before="40"/>
+        <w:rPr>
+          <w:color w:val="auto"/>
           <w:sz w:val="20"/>
           <w:szCs w:val="24"/>
         </w:rPr>
       </w:pPr>
       <w:hyperlink r:id="rId13" w:history="1">
-        <w:proofErr w:type="spellStart"/>
         <w:r>
           <w:rPr>
             <w:rStyle w:val="Hyperlink"/>
             <w:b/>
             <w:color w:val="auto"/>
-            <w:sz w:val="22"/>
+            <w:sz w:val="20"/>
             <w:szCs w:val="24"/>
             <w:u w:val="none"/>
           </w:rPr>
-          <w:t>Vocalix</w:t>
+          <w:t>A Hybrid CNN–YOLO Framework for Car Damage Severity Classification and Localization</w:t>
         </w:r>
-        <w:proofErr w:type="spellEnd"/>
         <w:r>
           <w:rPr>
             <w:rStyle w:val="Hyperlink"/>
             <w:b/>
             <w:color w:val="auto"/>
-            <w:sz w:val="22"/>
+            <w:sz w:val="20"/>
             <w:szCs w:val="24"/>
             <w:u w:val="none"/>
           </w:rPr>
-          <w:t xml:space="preserve"> — AI Voice Assistant</w:t>
+          <w:t xml:space="preserve"> </w:t>
+        </w:r>
+        <w:r>
+          <w:rPr>
+            <w:rStyle w:val="Hyperlink"/>
+            <w:rFonts w:ascii="Segoe UI Emoji" w:hAnsi="Segoe UI Emoji" w:cs="Segoe UI Emoji"/>
+            <w:color w:val="auto"/>
+            <w:u w:val="none"/>
+          </w:rPr>
+          <w:t>🔗</w:t>
         </w:r>
       </w:hyperlink>
-      <w:r>
-        <w:t xml:space="preserve"> </w:t>
-      </w:r>
-      <w:r>
-        <w:rPr>
-          <w:rFonts w:ascii="Segoe UI Emoji" w:hAnsi="Segoe UI Emoji" w:cs="Segoe UI Emoji"/>
-        </w:rPr>
-        <w:t>🔗</w:t>
-      </w:r>
-      <w:r>
-        <w:rPr>
-          <w:sz w:val="20"/>
-          <w:szCs w:val="24"/>
-        </w:rPr>
-        <w:tab/>
-      </w:r>
-      <w:r>
-        <w:rPr>
-          <w:color w:val="555555"/>
-          <w:sz w:val="20"/>
-          <w:szCs w:val="24"/>
-        </w:rPr>
-        <w:t>2025</w:t>
-      </w:r>
     </w:p>
     <w:p>
       <w:pPr>
-        <w:spacing w:after="40"/>
-        <w:rPr>
-          <w:sz w:val="20"/>
-          <w:szCs w:val="24"/>
-        </w:rPr>
-      </w:pPr>
-      <w:r>
-        <w:rPr>
-          <w:b/>
-          <w:color w:val="1A5276"/>
-          <w:sz w:val="18"/>
-          <w:szCs w:val="24"/>
-        </w:rPr>
-        <w:t>Python | Speech Recognition | LLM APIs | Automation</w:t>
+        <w:spacing w:after="20"/>
+        <w:rPr>
+          <w:sz w:val="20"/>
+          <w:szCs w:val="24"/>
+        </w:rPr>
+      </w:pPr>
+      <w:r>
+        <w:rPr>
+          <w:i/>
+          <w:color w:val="555555"/>
+          <w:sz w:val="20"/>
+          <w:szCs w:val="24"/>
+        </w:rPr>
+        <w:t>2026 IEEE International Conference on Natural Language Processing and Computer Vision (ICNPCV), Bengaluru, India</w:t>
       </w:r>
     </w:p>
     <w:p>
       <w:pPr>
         <w:pStyle w:val="ListBullet"/>
-        <w:numPr>
-          <w:ilvl w:val="0"/>
-          <w:numId w:val="16"/>
-        </w:numPr>
-        <w:tabs>
-          <w:tab w:val="clear" w:pos="720"/>
-        </w:tabs>
         <w:spacing w:after="20"/>
         <w:ind w:left="142" w:hanging="142"/>
         <w:rPr>
@@ -2081,19 +2359,32 @@
           <w:szCs w:val="24"/>
           <w:lang w:val="en-IN"/>
         </w:rPr>
-        <w:t>Built a voice-controlled AI assistant combining real-time speech recognition with LLM inference for natural language task automation and system-level command execution.</w:t>
+        <w:t xml:space="preserve">Published in </w:t>
+      </w:r>
+      <w:r>
+        <w:rPr>
+          <w:b/>
+          <w:bCs/>
+          <w:color w:val="2A2A2A"/>
+          <w:sz w:val="20"/>
+          <w:szCs w:val="24"/>
+          <w:lang w:val="en-IN"/>
+        </w:rPr>
+        <w:t>IEEE Xplore</w:t>
+      </w:r>
+      <w:r>
+        <w:rPr>
+          <w:color w:val="2A2A2A"/>
+          <w:sz w:val="20"/>
+          <w:szCs w:val="24"/>
+          <w:lang w:val="en-IN"/>
+        </w:rPr>
+        <w:t>, featuring peer-reviewed research on deep learning for automated vehicle damage assessment.</w:t>
       </w:r>
     </w:p>
     <w:p>
       <w:pPr>
         <w:pStyle w:val="ListBullet"/>
-        <w:numPr>
-          <w:ilvl w:val="0"/>
-          <w:numId w:val="16"/>
-        </w:numPr>
-        <w:tabs>
-          <w:tab w:val="clear" w:pos="720"/>
-        </w:tabs>
         <w:spacing w:after="20"/>
         <w:ind w:left="142" w:hanging="142"/>
         <w:rPr>
@@ -2110,23 +2401,8 @@
           <w:szCs w:val="24"/>
           <w:lang w:val="en-IN"/>
         </w:rPr>
-        <w:t>Engineered a modular speech-to-LLM-to-action pipeline with dynamic response generation and extensible command processing.</w:t>
-      </w:r>
-    </w:p>
-    <w:p>
-      <w:pPr>
-        <w:pStyle w:val="ListBullet"/>
-        <w:numPr>
-          <w:ilvl w:val="0"/>
-          <w:numId w:val="0"/>
-        </w:numPr>
-        <w:spacing w:after="20"/>
-        <w:ind w:left="-77"/>
-        <w:rPr>
-          <w:sz w:val="4"/>
-          <w:szCs w:val="4"/>
-        </w:rPr>
-      </w:pPr>
+        <w:t>Proposed a hybrid YOLO–CNN framework for vehicle damage localization and severity classification.</w:t>
+      </w:r>
     </w:p>
     <w:p>
       <w:pPr>
@@ -2146,107 +2422,6 @@
           <w:sz w:val="22"/>
           <w:szCs w:val="24"/>
         </w:rPr>
-        <w:t>PUBLICATIONS</w:t>
-      </w:r>
-    </w:p>
-    <w:p>
-      <w:pPr>
-        <w:spacing w:before="40"/>
-        <w:rPr>
-          <w:sz w:val="20"/>
-          <w:szCs w:val="24"/>
-        </w:rPr>
-      </w:pPr>
-      <w:r>
-        <w:rPr>
-          <w:b/>
-          <w:sz w:val="20"/>
-          <w:szCs w:val="24"/>
-        </w:rPr>
-        <w:t>A Hybrid CNN–YOLO Framework for Car Damage Severity Classification and Localization</w:t>
-      </w:r>
-    </w:p>
-    <w:p>
-      <w:pPr>
-        <w:spacing w:after="20"/>
-        <w:rPr>
-          <w:sz w:val="20"/>
-          <w:szCs w:val="24"/>
-        </w:rPr>
-      </w:pPr>
-      <w:r>
-        <w:rPr>
-          <w:i/>
-          <w:color w:val="555555"/>
-          <w:sz w:val="20"/>
-          <w:szCs w:val="24"/>
-        </w:rPr>
-        <w:t>2026 IEEE International Conference on Natural Language Processing and Computer Vision (ICNPCV), Bengaluru, India</w:t>
-      </w:r>
-    </w:p>
-    <w:p>
-      <w:pPr>
-        <w:pStyle w:val="ListBullet"/>
-        <w:numPr>
-          <w:ilvl w:val="0"/>
-          <w:numId w:val="18"/>
-        </w:numPr>
-        <w:tabs>
-          <w:tab w:val="clear" w:pos="720"/>
-          <w:tab w:val="num" w:pos="426"/>
-        </w:tabs>
-        <w:spacing w:after="20"/>
-        <w:ind w:left="142" w:hanging="142"/>
-        <w:rPr>
-          <w:color w:val="2A2A2A"/>
-          <w:sz w:val="20"/>
-          <w:szCs w:val="24"/>
-          <w:lang w:val="en-IN"/>
-        </w:rPr>
-      </w:pPr>
-      <w:r>
-        <w:rPr>
-          <w:color w:val="2A2A2A"/>
-          <w:sz w:val="20"/>
-          <w:szCs w:val="24"/>
-          <w:lang w:val="en-IN"/>
-        </w:rPr>
-        <w:t>Peer-reviewed research on a hybrid deep learning architecture combining YOLO object detection with CNN classification for automated vehicle damage severity assessment. Presented at the conference.</w:t>
-      </w:r>
-    </w:p>
-    <w:p>
-      <w:pPr>
-        <w:pStyle w:val="ListBullet"/>
-        <w:numPr>
-          <w:ilvl w:val="0"/>
-          <w:numId w:val="0"/>
-        </w:numPr>
-        <w:spacing w:after="20"/>
-        <w:ind w:left="-77"/>
-        <w:rPr>
-          <w:sz w:val="4"/>
-          <w:szCs w:val="4"/>
-        </w:rPr>
-      </w:pPr>
-    </w:p>
-    <w:p>
-      <w:pPr>
-        <w:pBdr>
-          <w:bottom w:val="single" w:sz="4" w:space="1" w:color="CCCCCC"/>
-        </w:pBdr>
-        <w:spacing w:before="120" w:after="60"/>
-        <w:rPr>
-          <w:sz w:val="20"/>
-          <w:szCs w:val="24"/>
-        </w:rPr>
-      </w:pPr>
-      <w:r>
-        <w:rPr>
-          <w:b/>
-          <w:color w:val="0D0D0D"/>
-          <w:sz w:val="22"/>
-          <w:szCs w:val="24"/>
-        </w:rPr>
         <w:t>EDUCATION</w:t>
       </w:r>
     </w:p>
@@ -2321,45 +2496,7 @@
           <w:sz w:val="20"/>
           <w:szCs w:val="24"/>
         </w:rPr>
-        <w:t xml:space="preserve">                                                                                             </w:t>
-      </w:r>
-      <w:proofErr w:type="gramStart"/>
-      <w:r>
-        <w:rPr>
-          <w:color w:val="444444"/>
-          <w:sz w:val="20"/>
-          <w:szCs w:val="24"/>
-        </w:rPr>
-        <w:t xml:space="preserve">   </w:t>
-      </w:r>
-      <w:r>
-        <w:rPr>
-          <w:b/>
-          <w:bCs/>
-          <w:color w:val="444444"/>
-          <w:sz w:val="20"/>
-          <w:szCs w:val="24"/>
-        </w:rPr>
-        <w:t>(</w:t>
-      </w:r>
-      <w:proofErr w:type="gramEnd"/>
-      <w:r>
-        <w:rPr>
-          <w:b/>
-          <w:bCs/>
-          <w:color w:val="444444"/>
-          <w:sz w:val="20"/>
-          <w:szCs w:val="24"/>
-        </w:rPr>
-        <w:t>Graduated</w:t>
-      </w:r>
-      <w:r>
-        <w:rPr>
-          <w:color w:val="444444"/>
-          <w:sz w:val="20"/>
-          <w:szCs w:val="24"/>
-        </w:rPr>
-        <w:t>)</w:t>
+        <w:t xml:space="preserve">                                                                                               </w:t>
       </w:r>
     </w:p>
     <w:p>
@@ -2549,7 +2686,7 @@
 </file>
 
 <file path=word/numbering.xml><?xml version="1.0" encoding="utf-8"?>
-<w:numbering xmlns:wpc="http://schemas.microsoft.com/office/word/2010/wordprocessingCanvas" xmlns:cx="http://schemas.microsoft.com/office/drawing/2014/chartex" xmlns:cx1="http://schemas.microsoft.com/office/drawing/2015/9/8/chartex" xmlns:cx2="http://schemas.microsoft.com/office/drawing/2015/10/21/chartex" xmlns:cx3="http://schemas.microsoft.com/office/drawing/2016/5/9/chartex" xmlns:cx4="http://schemas.microsoft.com/office/drawing/2016/5/10/chartex" xmlns:cx5="http://schemas.microsoft.com/office/drawing/2016/5/11/chartex" xmlns:cx6="http://schemas.microsoft.com/office/drawing/2016/5/12/chartex" xmlns:cx7="http://schemas.microsoft.com/office/drawing/2016/5/13/chartex" xmlns:cx8="http://schemas.microsoft.com/office/drawing/2016/5/14/chartex" xmlns:mc="http://schemas.openxmlformats.org/markup-compatibility/2006" xmlns:aink="http://schemas.microsoft.com/office/drawing/2016/ink" xmlns:am3d="http://schemas.microsoft.com/office/drawing/2017/model3d" xmlns:o="urn:schemas-microsoft-com:office:office" xmlns:oel="http://schemas.microsoft.com/office/2019/extlst" xmlns:r="http://schemas.openxmlformats.org/officeDocument/2006/relationships" xmlns:m="http://schemas.openxmlformats.org/officeDocument/2006/math" xmlns:v="urn:schemas-microsoft-com:vml" xmlns:wp14="http://schemas.microsoft.com/office/word/2010/wordprocessingDrawing" xmlns:wp="http://schemas.openxmlformats.org/drawingml/2006/wordprocessingDrawing" xmlns:w10="urn:schemas-microsoft-com:office:word" xmlns:w="http://schemas.openxmlformats.org/wordprocessingml/2006/main" xmlns:w14="http://schemas.microsoft.com/office/word/2010/wordml" xmlns:w15="http://schemas.microsoft.com/office/word/2012/wordml" xmlns:w16cei="http://schemas.microsoft.com/office/word/2026/wordml/cei" xmlns:w16cex="http://schemas.microsoft.com/office/word/2018/wordml/cex" xmlns:w16cid="http://schemas.microsoft.com/office/word/2016/wordml/cid" xmlns:w16="http://schemas.microsoft.com/office/word/2018/wordml" xmlns:w16du="http://schemas.microsoft.com/office/word/2023/wordml/word16du" xmlns:w16sdtdh="http://schemas.microsoft.com/office/word/2020/wordml/sdtdatahash" xmlns:w16sdtfl="http://schemas.microsoft.com/office/word/2024/wordml/sdtformatlock" xmlns:w16se="http://schemas.microsoft.com/office/word/2015/wordml/symex" xmlns:wpg="http://schemas.microsoft.com/office/word/2010/wordprocessingGroup" xmlns:wpi="http://schemas.microsoft.com/office/word/2010/wordprocessingInk" xmlns:wne="http://schemas.microsoft.com/office/word/2006/wordml" xmlns:wps="http://schemas.microsoft.com/office/word/2010/wordprocessingShape" mc:Ignorable="w14 w15 w16se w16cid w16 w16cex w16sdtdh w16sdtfl w16du wp14">
+<w:numbering xmlns:wpc="http://schemas.microsoft.com/office/word/2010/wordprocessingCanvas" xmlns:cx="http://schemas.microsoft.com/office/drawing/2014/chartex" xmlns:cx1="http://schemas.microsoft.com/office/drawing/2015/9/8/chartex" xmlns:cx2="http://schemas.microsoft.com/office/drawing/2015/10/21/chartex" xmlns:cx3="http://schemas.microsoft.com/office/drawing/2016/5/9/chartex" xmlns:cx4="http://schemas.microsoft.com/office/drawing/2016/5/10/chartex" xmlns:cx5="http://schemas.microsoft.com/office/drawing/2016/5/11/chartex" xmlns:cx6="http://schemas.microsoft.com/office/drawing/2016/5/12/chartex" xmlns:cx7="http://schemas.microsoft.com/office/drawing/2016/5/13/chartex" xmlns:cx8="http://schemas.microsoft.com/office/drawing/2016/5/14/chartex" xmlns:mc="http://schemas.openxmlformats.org/markup-compatibility/2006" xmlns:aink="http://schemas.microsoft.com/office/drawing/2016/ink" xmlns:am3d="http://schemas.microsoft.com/office/drawing/2017/model3d" xmlns:o="urn:schemas-microsoft-com:office:office" xmlns:oel="http://schemas.microsoft.com/office/2019/extlst" xmlns:r="http://schemas.openxmlformats.org/officeDocument/2006/relationships" xmlns:m="http://schemas.openxmlformats.org/officeDocument/2006/math" xmlns:v="urn:schemas-microsoft-com:vml" xmlns:wp14="http://schemas.microsoft.com/office/word/2010/wordprocessingDrawing" xmlns:wp="http://schemas.openxmlformats.org/drawingml/2006/wordprocessingDrawing" xmlns:w10="urn:schemas-microsoft-com:office:word" xmlns:w="http://schemas.openxmlformats.org/wordprocessingml/2006/main" xmlns:w14="http://schemas.microsoft.com/office/word/2010/wordml" xmlns:w15="http://schemas.microsoft.com/office/word/2012/wordml" xmlns:w16cex="http://schemas.microsoft.com/office/word/2018/wordml/cex" xmlns:w16cid="http://schemas.microsoft.com/office/word/2016/wordml/cid" xmlns:w16="http://schemas.microsoft.com/office/word/2018/wordml" xmlns:w16du="http://schemas.microsoft.com/office/word/2023/wordml/word16du" xmlns:w16sdtdh="http://schemas.microsoft.com/office/word/2020/wordml/sdtdatahash" xmlns:w16sdtfl="http://schemas.microsoft.com/office/word/2024/wordml/sdtformatlock" xmlns:w16se="http://schemas.microsoft.com/office/word/2015/wordml/symex" xmlns:wpg="http://schemas.microsoft.com/office/word/2010/wordprocessingGroup" xmlns:wpi="http://schemas.microsoft.com/office/word/2010/wordprocessingInk" xmlns:wne="http://schemas.microsoft.com/office/word/2006/wordml" xmlns:wps="http://schemas.microsoft.com/office/word/2010/wordprocessingShape" mc:Ignorable="w14 w15 w16se w16cid w16 w16cex w16sdtdh w16sdtfl w16du wp14">
   <w:abstractNum w:abstractNumId="0" w15:restartNumberingAfterBreak="0">
     <w:nsid w:val="FFFFFF7C"/>
     <w:multiLevelType w:val="singleLevel"/>
@@ -2703,7 +2840,7 @@
   <w:abstractNum w:abstractNumId="8" w15:restartNumberingAfterBreak="0">
     <w:nsid w:val="FFFFFF89"/>
     <w:multiLevelType w:val="singleLevel"/>
-    <w:tmpl w:val="D270B474"/>
+    <w:tmpl w:val="9C307B6C"/>
     <w:lvl w:ilvl="0">
       <w:start w:val="1"/>
       <w:numFmt w:val="bullet"/>
@@ -3467,6 +3604,381 @@
     </w:lvl>
   </w:abstractNum>
   <w:abstractNum w:abstractNumId="14" w15:restartNumberingAfterBreak="0">
+    <w:nsid w:val="3E4F2C47"/>
+    <w:multiLevelType w:val="hybridMultilevel"/>
+    <w:tmpl w:val="B288A416"/>
+    <w:lvl w:ilvl="0" w:tplc="40090001">
+      <w:start w:val="1"/>
+      <w:numFmt w:val="bullet"/>
+      <w:lvlText w:val=""/>
+      <w:lvlJc w:val="left"/>
+      <w:pPr>
+        <w:ind w:left="720" w:hanging="360"/>
+      </w:pPr>
+      <w:rPr>
+        <w:rFonts w:ascii="Symbol" w:hAnsi="Symbol" w:hint="default"/>
+      </w:rPr>
+    </w:lvl>
+    <w:lvl w:ilvl="1" w:tplc="40090003" w:tentative="1">
+      <w:start w:val="1"/>
+      <w:numFmt w:val="bullet"/>
+      <w:lvlText w:val="o"/>
+      <w:lvlJc w:val="left"/>
+      <w:pPr>
+        <w:ind w:left="1440" w:hanging="360"/>
+      </w:pPr>
+      <w:rPr>
+        <w:rFonts w:ascii="Courier New" w:hAnsi="Courier New" w:cs="Courier New" w:hint="default"/>
+      </w:rPr>
+    </w:lvl>
+    <w:lvl w:ilvl="2" w:tplc="40090005" w:tentative="1">
+      <w:start w:val="1"/>
+      <w:numFmt w:val="bullet"/>
+      <w:lvlText w:val=""/>
+      <w:lvlJc w:val="left"/>
+      <w:pPr>
+        <w:ind w:left="2160" w:hanging="360"/>
+      </w:pPr>
+      <w:rPr>
+        <w:rFonts w:ascii="Wingdings" w:hAnsi="Wingdings" w:hint="default"/>
+      </w:rPr>
+    </w:lvl>
+    <w:lvl w:ilvl="3" w:tplc="40090001" w:tentative="1">
+      <w:start w:val="1"/>
+      <w:numFmt w:val="bullet"/>
+      <w:lvlText w:val=""/>
+      <w:lvlJc w:val="left"/>
+      <w:pPr>
+        <w:ind w:left="2880" w:hanging="360"/>
+      </w:pPr>
+      <w:rPr>
+        <w:rFonts w:ascii="Symbol" w:hAnsi="Symbol" w:hint="default"/>
+      </w:rPr>
+    </w:lvl>
+    <w:lvl w:ilvl="4" w:tplc="40090003" w:tentative="1">
+      <w:start w:val="1"/>
+      <w:numFmt w:val="bullet"/>
+      <w:lvlText w:val="o"/>
+      <w:lvlJc w:val="left"/>
+      <w:pPr>
+        <w:ind w:left="3600" w:hanging="360"/>
+      </w:pPr>
+      <w:rPr>
+        <w:rFonts w:ascii="Courier New" w:hAnsi="Courier New" w:cs="Courier New" w:hint="default"/>
+      </w:rPr>
+    </w:lvl>
+    <w:lvl w:ilvl="5" w:tplc="40090005" w:tentative="1">
+      <w:start w:val="1"/>
+      <w:numFmt w:val="bullet"/>
+      <w:lvlText w:val=""/>
+      <w:lvlJc w:val="left"/>
+      <w:pPr>
+        <w:ind w:left="4320" w:hanging="360"/>
+      </w:pPr>
+      <w:rPr>
+        <w:rFonts w:ascii="Wingdings" w:hAnsi="Wingdings" w:hint="default"/>
+      </w:rPr>
+    </w:lvl>
+    <w:lvl w:ilvl="6" w:tplc="40090001" w:tentative="1">
+      <w:start w:val="1"/>
+      <w:numFmt w:val="bullet"/>
+      <w:lvlText w:val=""/>
+      <w:lvlJc w:val="left"/>
+      <w:pPr>
+        <w:ind w:left="5040" w:hanging="360"/>
+      </w:pPr>
+      <w:rPr>
+        <w:rFonts w:ascii="Symbol" w:hAnsi="Symbol" w:hint="default"/>
+      </w:rPr>
+    </w:lvl>
+    <w:lvl w:ilvl="7" w:tplc="40090003" w:tentative="1">
+      <w:start w:val="1"/>
+      <w:numFmt w:val="bullet"/>
+      <w:lvlText w:val="o"/>
+      <w:lvlJc w:val="left"/>
+      <w:pPr>
+        <w:ind w:left="5760" w:hanging="360"/>
+      </w:pPr>
+      <w:rPr>
+        <w:rFonts w:ascii="Courier New" w:hAnsi="Courier New" w:cs="Courier New" w:hint="default"/>
+      </w:rPr>
+    </w:lvl>
+    <w:lvl w:ilvl="8" w:tplc="40090005" w:tentative="1">
+      <w:start w:val="1"/>
+      <w:numFmt w:val="bullet"/>
+      <w:lvlText w:val=""/>
+      <w:lvlJc w:val="left"/>
+      <w:pPr>
+        <w:ind w:left="6480" w:hanging="360"/>
+      </w:pPr>
+      <w:rPr>
+        <w:rFonts w:ascii="Wingdings" w:hAnsi="Wingdings" w:hint="default"/>
+      </w:rPr>
+    </w:lvl>
+  </w:abstractNum>
+  <w:abstractNum w:abstractNumId="15" w15:restartNumberingAfterBreak="0">
+    <w:nsid w:val="51F27060"/>
+    <w:multiLevelType w:val="hybridMultilevel"/>
+    <w:tmpl w:val="CFAC8646"/>
+    <w:lvl w:ilvl="0" w:tplc="40090001">
+      <w:start w:val="1"/>
+      <w:numFmt w:val="bullet"/>
+      <w:lvlText w:val=""/>
+      <w:lvlJc w:val="left"/>
+      <w:pPr>
+        <w:ind w:left="720" w:hanging="360"/>
+      </w:pPr>
+      <w:rPr>
+        <w:rFonts w:ascii="Symbol" w:hAnsi="Symbol" w:hint="default"/>
+      </w:rPr>
+    </w:lvl>
+    <w:lvl w:ilvl="1" w:tplc="40090003" w:tentative="1">
+      <w:start w:val="1"/>
+      <w:numFmt w:val="bullet"/>
+      <w:lvlText w:val="o"/>
+      <w:lvlJc w:val="left"/>
+      <w:pPr>
+        <w:ind w:left="1440" w:hanging="360"/>
+      </w:pPr>
+      <w:rPr>
+        <w:rFonts w:ascii="Courier New" w:hAnsi="Courier New" w:cs="Courier New" w:hint="default"/>
+      </w:rPr>
+    </w:lvl>
+    <w:lvl w:ilvl="2" w:tplc="40090005" w:tentative="1">
+      <w:start w:val="1"/>
+      <w:numFmt w:val="bullet"/>
+      <w:lvlText w:val=""/>
+      <w:lvlJc w:val="left"/>
+      <w:pPr>
+        <w:ind w:left="2160" w:hanging="360"/>
+      </w:pPr>
+      <w:rPr>
+        <w:rFonts w:ascii="Wingdings" w:hAnsi="Wingdings" w:hint="default"/>
+      </w:rPr>
+    </w:lvl>
+    <w:lvl w:ilvl="3" w:tplc="40090001" w:tentative="1">
+      <w:start w:val="1"/>
+      <w:numFmt w:val="bullet"/>
+      <w:lvlText w:val=""/>
+      <w:lvlJc w:val="left"/>
+      <w:pPr>
+        <w:ind w:left="2880" w:hanging="360"/>
+      </w:pPr>
+      <w:rPr>
+        <w:rFonts w:ascii="Symbol" w:hAnsi="Symbol" w:hint="default"/>
+      </w:rPr>
+    </w:lvl>
+    <w:lvl w:ilvl="4" w:tplc="40090003" w:tentative="1">
+      <w:start w:val="1"/>
+      <w:numFmt w:val="bullet"/>
+      <w:lvlText w:val="o"/>
+      <w:lvlJc w:val="left"/>
+      <w:pPr>
+        <w:ind w:left="3600" w:hanging="360"/>
+      </w:pPr>
+      <w:rPr>
+        <w:rFonts w:ascii="Courier New" w:hAnsi="Courier New" w:cs="Courier New" w:hint="default"/>
+      </w:rPr>
+    </w:lvl>
+    <w:lvl w:ilvl="5" w:tplc="40090005" w:tentative="1">
+      <w:start w:val="1"/>
+      <w:numFmt w:val="bullet"/>
+      <w:lvlText w:val=""/>
+      <w:lvlJc w:val="left"/>
+      <w:pPr>
+        <w:ind w:left="4320" w:hanging="360"/>
+      </w:pPr>
+      <w:rPr>
+        <w:rFonts w:ascii="Wingdings" w:hAnsi="Wingdings" w:hint="default"/>
+      </w:rPr>
+    </w:lvl>
+    <w:lvl w:ilvl="6" w:tplc="40090001" w:tentative="1">
+      <w:start w:val="1"/>
+      <w:numFmt w:val="bullet"/>
+      <w:lvlText w:val=""/>
+      <w:lvlJc w:val="left"/>
+      <w:pPr>
+        <w:ind w:left="5040" w:hanging="360"/>
+      </w:pPr>
+      <w:rPr>
+        <w:rFonts w:ascii="Symbol" w:hAnsi="Symbol" w:hint="default"/>
+      </w:rPr>
+    </w:lvl>
+    <w:lvl w:ilvl="7" w:tplc="40090003" w:tentative="1">
+      <w:start w:val="1"/>
+      <w:numFmt w:val="bullet"/>
+      <w:lvlText w:val="o"/>
+      <w:lvlJc w:val="left"/>
+      <w:pPr>
+        <w:ind w:left="5760" w:hanging="360"/>
+      </w:pPr>
+      <w:rPr>
+        <w:rFonts w:ascii="Courier New" w:hAnsi="Courier New" w:cs="Courier New" w:hint="default"/>
+      </w:rPr>
+    </w:lvl>
+    <w:lvl w:ilvl="8" w:tplc="40090005" w:tentative="1">
+      <w:start w:val="1"/>
+      <w:numFmt w:val="bullet"/>
+      <w:lvlText w:val=""/>
+      <w:lvlJc w:val="left"/>
+      <w:pPr>
+        <w:ind w:left="6480" w:hanging="360"/>
+      </w:pPr>
+      <w:rPr>
+        <w:rFonts w:ascii="Wingdings" w:hAnsi="Wingdings" w:hint="default"/>
+      </w:rPr>
+    </w:lvl>
+  </w:abstractNum>
+  <w:abstractNum w:abstractNumId="16" w15:restartNumberingAfterBreak="0">
+    <w:nsid w:val="5456376D"/>
+    <w:multiLevelType w:val="multilevel"/>
+    <w:tmpl w:val="1ACA38C2"/>
+    <w:lvl w:ilvl="0">
+      <w:start w:val="1"/>
+      <w:numFmt w:val="bullet"/>
+      <w:lvlText w:val=""/>
+      <w:lvlJc w:val="left"/>
+      <w:pPr>
+        <w:tabs>
+          <w:tab w:val="num" w:pos="720"/>
+        </w:tabs>
+        <w:ind w:left="720" w:hanging="360"/>
+      </w:pPr>
+      <w:rPr>
+        <w:rFonts w:ascii="Symbol" w:hAnsi="Symbol" w:hint="default"/>
+        <w:sz w:val="20"/>
+      </w:rPr>
+    </w:lvl>
+    <w:lvl w:ilvl="1" w:tentative="1">
+      <w:start w:val="1"/>
+      <w:numFmt w:val="bullet"/>
+      <w:lvlText w:val="o"/>
+      <w:lvlJc w:val="left"/>
+      <w:pPr>
+        <w:tabs>
+          <w:tab w:val="num" w:pos="1440"/>
+        </w:tabs>
+        <w:ind w:left="1440" w:hanging="360"/>
+      </w:pPr>
+      <w:rPr>
+        <w:rFonts w:ascii="Courier New" w:hAnsi="Courier New" w:hint="default"/>
+        <w:sz w:val="20"/>
+      </w:rPr>
+    </w:lvl>
+    <w:lvl w:ilvl="2" w:tentative="1">
+      <w:start w:val="1"/>
+      <w:numFmt w:val="bullet"/>
+      <w:lvlText w:val=""/>
+      <w:lvlJc w:val="left"/>
+      <w:pPr>
+        <w:tabs>
+          <w:tab w:val="num" w:pos="2160"/>
+        </w:tabs>
+        <w:ind w:left="2160" w:hanging="360"/>
+      </w:pPr>
+      <w:rPr>
+        <w:rFonts w:ascii="Wingdings" w:hAnsi="Wingdings" w:hint="default"/>
+        <w:sz w:val="20"/>
+      </w:rPr>
+    </w:lvl>
+    <w:lvl w:ilvl="3" w:tentative="1">
+      <w:start w:val="1"/>
+      <w:numFmt w:val="bullet"/>
+      <w:lvlText w:val=""/>
+      <w:lvlJc w:val="left"/>
+      <w:pPr>
+        <w:tabs>
+          <w:tab w:val="num" w:pos="2880"/>
+        </w:tabs>
+        <w:ind w:left="2880" w:hanging="360"/>
+      </w:pPr>
+      <w:rPr>
+        <w:rFonts w:ascii="Wingdings" w:hAnsi="Wingdings" w:hint="default"/>
+        <w:sz w:val="20"/>
+      </w:rPr>
+    </w:lvl>
+    <w:lvl w:ilvl="4" w:tentative="1">
+      <w:start w:val="1"/>
+      <w:numFmt w:val="bullet"/>
+      <w:lvlText w:val=""/>
+      <w:lvlJc w:val="left"/>
+      <w:pPr>
+        <w:tabs>
+          <w:tab w:val="num" w:pos="3600"/>
+        </w:tabs>
+        <w:ind w:left="3600" w:hanging="360"/>
+      </w:pPr>
+      <w:rPr>
+        <w:rFonts w:ascii="Wingdings" w:hAnsi="Wingdings" w:hint="default"/>
+        <w:sz w:val="20"/>
+      </w:rPr>
+    </w:lvl>
+    <w:lvl w:ilvl="5" w:tentative="1">
+      <w:start w:val="1"/>
+      <w:numFmt w:val="bullet"/>
+      <w:lvlText w:val=""/>
+      <w:lvlJc w:val="left"/>
+      <w:pPr>
+        <w:tabs>
+          <w:tab w:val="num" w:pos="4320"/>
+        </w:tabs>
+        <w:ind w:left="4320" w:hanging="360"/>
+      </w:pPr>
+      <w:rPr>
+        <w:rFonts w:ascii="Wingdings" w:hAnsi="Wingdings" w:hint="default"/>
+        <w:sz w:val="20"/>
+      </w:rPr>
+    </w:lvl>
+    <w:lvl w:ilvl="6" w:tentative="1">
+      <w:start w:val="1"/>
+      <w:numFmt w:val="bullet"/>
+      <w:lvlText w:val=""/>
+      <w:lvlJc w:val="left"/>
+      <w:pPr>
+        <w:tabs>
+          <w:tab w:val="num" w:pos="5040"/>
+        </w:tabs>
+        <w:ind w:left="5040" w:hanging="360"/>
+      </w:pPr>
+      <w:rPr>
+        <w:rFonts w:ascii="Wingdings" w:hAnsi="Wingdings" w:hint="default"/>
+        <w:sz w:val="20"/>
+      </w:rPr>
+    </w:lvl>
+    <w:lvl w:ilvl="7" w:tentative="1">
+      <w:start w:val="1"/>
+      <w:numFmt w:val="bullet"/>
+      <w:lvlText w:val=""/>
+      <w:lvlJc w:val="left"/>
+      <w:pPr>
+        <w:tabs>
+          <w:tab w:val="num" w:pos="5760"/>
+        </w:tabs>
+        <w:ind w:left="5760" w:hanging="360"/>
+      </w:pPr>
+      <w:rPr>
+        <w:rFonts w:ascii="Wingdings" w:hAnsi="Wingdings" w:hint="default"/>
+        <w:sz w:val="20"/>
+      </w:rPr>
+    </w:lvl>
+    <w:lvl w:ilvl="8" w:tentative="1">
+      <w:start w:val="1"/>
+      <w:numFmt w:val="bullet"/>
+      <w:lvlText w:val=""/>
+      <w:lvlJc w:val="left"/>
+      <w:pPr>
+        <w:tabs>
+          <w:tab w:val="num" w:pos="6480"/>
+        </w:tabs>
+        <w:ind w:left="6480" w:hanging="360"/>
+      </w:pPr>
+      <w:rPr>
+        <w:rFonts w:ascii="Wingdings" w:hAnsi="Wingdings" w:hint="default"/>
+        <w:sz w:val="20"/>
+      </w:rPr>
+    </w:lvl>
+  </w:abstractNum>
+  <w:abstractNum w:abstractNumId="17" w15:restartNumberingAfterBreak="0">
     <w:nsid w:val="567B6A73"/>
     <w:multiLevelType w:val="multilevel"/>
     <w:tmpl w:val="F2D2266E"/>
@@ -3615,7 +4127,7 @@
       </w:rPr>
     </w:lvl>
   </w:abstractNum>
-  <w:abstractNum w:abstractNumId="15" w15:restartNumberingAfterBreak="0">
+  <w:abstractNum w:abstractNumId="18" w15:restartNumberingAfterBreak="0">
     <w:nsid w:val="63144E36"/>
     <w:multiLevelType w:val="multilevel"/>
     <w:tmpl w:val="67721728"/>
@@ -3764,7 +4276,7 @@
       </w:rPr>
     </w:lvl>
   </w:abstractNum>
-  <w:abstractNum w:abstractNumId="16" w15:restartNumberingAfterBreak="0">
+  <w:abstractNum w:abstractNumId="19" w15:restartNumberingAfterBreak="0">
     <w:nsid w:val="7CD25237"/>
     <w:multiLevelType w:val="multilevel"/>
     <w:tmpl w:val="396E9D48"/>
@@ -3913,7 +4425,7 @@
       </w:rPr>
     </w:lvl>
   </w:abstractNum>
-  <w:abstractNum w:abstractNumId="17" w15:restartNumberingAfterBreak="0">
+  <w:abstractNum w:abstractNumId="20" w15:restartNumberingAfterBreak="0">
     <w:nsid w:val="7EEC6887"/>
     <w:multiLevelType w:val="multilevel"/>
     <w:tmpl w:val="8D6AA226"/>
@@ -4090,10 +4602,10 @@
     <w:abstractNumId w:val="0"/>
   </w:num>
   <w:num w:numId="10" w16cid:durableId="1699356747">
-    <w:abstractNumId w:val="15"/>
+    <w:abstractNumId w:val="18"/>
   </w:num>
   <w:num w:numId="11" w16cid:durableId="365756664">
-    <w:abstractNumId w:val="17"/>
+    <w:abstractNumId w:val="20"/>
   </w:num>
   <w:num w:numId="12" w16cid:durableId="843470511">
     <w:abstractNumId w:val="11"/>
@@ -4102,7 +4614,7 @@
     <w:abstractNumId w:val="10"/>
   </w:num>
   <w:num w:numId="14" w16cid:durableId="1486512868">
-    <w:abstractNumId w:val="14"/>
+    <w:abstractNumId w:val="17"/>
   </w:num>
   <w:num w:numId="15" w16cid:durableId="1340623433">
     <w:abstractNumId w:val="9"/>
@@ -4114,7 +4626,16 @@
     <w:abstractNumId w:val="12"/>
   </w:num>
   <w:num w:numId="18" w16cid:durableId="2092963840">
+    <w:abstractNumId w:val="19"/>
+  </w:num>
+  <w:num w:numId="19" w16cid:durableId="876312555">
+    <w:abstractNumId w:val="14"/>
+  </w:num>
+  <w:num w:numId="20" w16cid:durableId="2020081956">
     <w:abstractNumId w:val="16"/>
+  </w:num>
+  <w:num w:numId="21" w16cid:durableId="1455294796">
+    <w:abstractNumId w:val="15"/>
   </w:num>
 </w:numbering>
 </file>
@@ -4508,7 +5029,7 @@
   <w:style w:type="paragraph" w:default="1" w:styleId="Normal">
     <w:name w:val="Normal"/>
     <w:qFormat/>
-    <w:rsid w:val="00CD67A0"/>
+    <w:rsid w:val="00873DF9"/>
     <w:pPr>
       <w:spacing w:after="0"/>
     </w:pPr>

</xml_diff>